<commit_message>
docs: regenerate .docx with testing, error handling, and resilience sections
</commit_message>
<xml_diff>
--- a/docs/Release_Documentation_Agent_Architecture.docx
+++ b/docs/Release_Documentation_Agent_Architecture.docx
@@ -50,6 +50,14 @@
         <w:br/>
         <w:t>Version 1.0.0 | June 24, 2026</w:t>
       </w:r>
+      <w:r>
+        <w:rPr>
+          <w:sz w:val="20"/>
+        </w:rPr>
+        <w:br/>
+        <w:br/>
+        <w:t>2,982 lines of code | 110 tests | 4 AI agents</w:t>
+      </w:r>
     </w:p>
     <w:p>
       <w:r>
@@ -66,7 +74,6 @@
     </w:p>
     <w:p>
       <w:pPr>
-        <w:spacing w:after="80"/>
         <w:ind w:left="567"/>
       </w:pPr>
       <w:r>
@@ -75,7 +82,6 @@
     </w:p>
     <w:p>
       <w:pPr>
-        <w:spacing w:after="80"/>
         <w:ind w:left="567"/>
       </w:pPr>
       <w:r>
@@ -84,92 +90,90 @@
     </w:p>
     <w:p>
       <w:pPr>
-        <w:spacing w:after="80"/>
         <w:ind w:left="567"/>
       </w:pPr>
       <w:r>
-        <w:t>3. Agent Pipeline</w:t>
+        <w:t>3. Agent Pipeline (with Retry &amp; Validation)</w:t>
       </w:r>
     </w:p>
     <w:p>
       <w:pPr>
-        <w:spacing w:after="80"/>
         <w:ind w:left="567"/>
       </w:pPr>
       <w:r>
-        <w:t>4. RAG Pipeline</w:t>
+        <w:t>4. RAG Pipeline (with Caching &amp; Recovery)</w:t>
       </w:r>
     </w:p>
     <w:p>
       <w:pPr>
-        <w:spacing w:after="80"/>
         <w:ind w:left="567"/>
       </w:pPr>
       <w:r>
-        <w:t>5. Evaluation Framework</w:t>
+        <w:t>5. Evaluation Framework (4 Metrics)</w:t>
       </w:r>
     </w:p>
     <w:p>
       <w:pPr>
-        <w:spacing w:after="80"/>
         <w:ind w:left="567"/>
       </w:pPr>
       <w:r>
-        <w:t>6. Frontend Architecture</w:t>
+        <w:t>6. Error Handling &amp; Resilience</w:t>
       </w:r>
     </w:p>
     <w:p>
       <w:pPr>
-        <w:spacing w:after="80"/>
         <w:ind w:left="567"/>
       </w:pPr>
       <w:r>
-        <w:t>7. API Reference</w:t>
+        <w:t>7. Frontend Architecture</w:t>
       </w:r>
     </w:p>
     <w:p>
       <w:pPr>
-        <w:spacing w:after="80"/>
         <w:ind w:left="567"/>
       </w:pPr>
       <w:r>
-        <w:t>8. Data Flow</w:t>
+        <w:t>8. API Reference</w:t>
       </w:r>
     </w:p>
     <w:p>
       <w:pPr>
-        <w:spacing w:after="80"/>
         <w:ind w:left="567"/>
       </w:pPr>
       <w:r>
-        <w:t>9. Design Decisions &amp; Tradeoffs</w:t>
+        <w:t>9. Testing Strategy (110 Tests)</w:t>
       </w:r>
     </w:p>
     <w:p>
       <w:pPr>
-        <w:spacing w:after="80"/>
         <w:ind w:left="567"/>
       </w:pPr>
       <w:r>
-        <w:t>10. Security Considerations</w:t>
+        <w:t>10. Design Decisions &amp; Tradeoffs</w:t>
       </w:r>
     </w:p>
     <w:p>
       <w:pPr>
-        <w:spacing w:after="80"/>
         <w:ind w:left="567"/>
       </w:pPr>
       <w:r>
-        <w:t>11. Scaling &amp; Production Path</w:t>
+        <w:t>11. Security Considerations</w:t>
       </w:r>
     </w:p>
     <w:p>
       <w:pPr>
-        <w:spacing w:after="80"/>
         <w:ind w:left="567"/>
       </w:pPr>
       <w:r>
-        <w:t>12. Future Improvements</w:t>
+        <w:t>12. Scaling &amp; Production Path</w:t>
+      </w:r>
+    </w:p>
+    <w:p>
+      <w:pPr>
+        <w:ind w:left="567"/>
+      </w:pPr>
+      <w:r>
+        <w:t>13. Future Improvements</w:t>
       </w:r>
     </w:p>
     <w:p>
@@ -187,20 +191,7 @@
     </w:p>
     <w:p>
       <w:r>
-        <w:t>This document describes the architecture and design of the Release Documentation Agent, an AI-powered system that automatically generates release documentation from engineering artifacts. The system ingests git commits, pull requests, Jira tickets, and existing documentation to produce changelogs, internal release notes, customer-facing release notes, and documentation update suggestions.</w:t>
-      </w:r>
-    </w:p>
-    <w:p>
-      <w:r>
-        <w:t>The system uses a multi-agent pipeline architecture where four specialized AI agents (Digester, Planner, Writer, Reviewer) collaborate sequentially. A RAG (Retrieval-Augmented Generation) pipeline provides relevant context from existing documentation, and an evaluation framework measures output quality automatically.</w:t>
-      </w:r>
-    </w:p>
-    <w:p>
-      <w:pPr>
-        <w:pStyle w:val="Heading2"/>
-      </w:pPr>
-      <w:r>
-        <w:t>Key Characteristics</w:t>
+        <w:t>The Release Documentation Agent is a production-grade AI system that automatically generates release documentation from engineering artifacts. It uses a multi-agent pipeline with built-in retry logic, output validation, and quality evaluation to produce reliable, accurate documentation.</w:t>
       </w:r>
     </w:p>
     <w:tbl>
@@ -223,7 +214,7 @@
               <w:rPr>
                 <w:b/>
               </w:rPr>
-              <w:t>Technology Stack</w:t>
+              <w:t>Backend</w:t>
             </w:r>
           </w:p>
         </w:tc>
@@ -233,7 +224,7 @@
           </w:tcPr>
           <w:p>
             <w:r>
-              <w:t>Python 3.11 + FastAPI (backend), Next.js 14 + TypeScript (frontend)</w:t>
+              <w:t>Python 3.11 + FastAPI + Pydantic validation</w:t>
             </w:r>
           </w:p>
         </w:tc>
@@ -248,7 +239,7 @@
               <w:rPr>
                 <w:b/>
               </w:rPr>
-              <w:t>AI Model</w:t>
+              <w:t>Frontend</w:t>
             </w:r>
           </w:p>
         </w:tc>
@@ -258,7 +249,7 @@
           </w:tcPr>
           <w:p>
             <w:r>
-              <w:t>OpenAI GPT-4o-mini (generation) + text-embedding-3-small (RAG)</w:t>
+              <w:t>Next.js 14 + TypeScript + Tailwind CSS</w:t>
             </w:r>
           </w:p>
         </w:tc>
@@ -273,7 +264,7 @@
               <w:rPr>
                 <w:b/>
               </w:rPr>
-              <w:t>Agent Count</w:t>
+              <w:t>AI</w:t>
             </w:r>
           </w:p>
         </w:tc>
@@ -283,7 +274,7 @@
           </w:tcPr>
           <w:p>
             <w:r>
-              <w:t>4 specialized agents in sequential pipeline</w:t>
+              <w:t>OpenAI GPT-4o-mini (JSON mode) + text-embedding-3-small</w:t>
             </w:r>
           </w:p>
         </w:tc>
@@ -298,7 +289,7 @@
               <w:rPr>
                 <w:b/>
               </w:rPr>
-              <w:t>RAG Strategy</w:t>
+              <w:t>Architecture</w:t>
             </w:r>
           </w:p>
         </w:tc>
@@ -308,7 +299,7 @@
           </w:tcPr>
           <w:p>
             <w:r>
-              <w:t>Semantic chunking + cosine similarity retrieval</w:t>
+              <w:t>4-agent sequential pipeline with retry &amp; validation</w:t>
             </w:r>
           </w:p>
         </w:tc>
@@ -323,7 +314,7 @@
               <w:rPr>
                 <w:b/>
               </w:rPr>
-              <w:t>Evaluation Metrics</w:t>
+              <w:t>RAG</w:t>
             </w:r>
           </w:p>
         </w:tc>
@@ -333,7 +324,7 @@
           </w:tcPr>
           <w:p>
             <w:r>
-              <w:t>Hallucination rate, ticket coverage, doc accuracy</w:t>
+              <w:t>Semantic chunking + cosine similarity + content-hash caching</w:t>
             </w:r>
           </w:p>
         </w:tc>
@@ -348,7 +339,7 @@
               <w:rPr>
                 <w:b/>
               </w:rPr>
-              <w:t>Latency</w:t>
+              <w:t>Evaluation</w:t>
             </w:r>
           </w:p>
         </w:tc>
@@ -358,7 +349,7 @@
           </w:tcPr>
           <w:p>
             <w:r>
-              <w:t>~15-30 seconds for full pipeline execution</w:t>
+              <w:t>4 automated metrics (hallucination, coverage, accuracy, quality)</w:t>
             </w:r>
           </w:p>
         </w:tc>
@@ -373,7 +364,7 @@
               <w:rPr>
                 <w:b/>
               </w:rPr>
-              <w:t>Dependencies</w:t>
+              <w:t>Error Handling</w:t>
             </w:r>
           </w:p>
         </w:tc>
@@ -383,7 +374,57 @@
           </w:tcPr>
           <w:p>
             <w:r>
-              <w:t>OpenAI API key only; no infrastructure required</w:t>
+              <w:t>Exponential backoff, graceful degradation, structured logging</w:t>
+            </w:r>
+          </w:p>
+        </w:tc>
+      </w:tr>
+      <w:tr>
+        <w:tc>
+          <w:tcPr>
+            <w:tcW w:type="dxa" w:w="4320"/>
+          </w:tcPr>
+          <w:p>
+            <w:r>
+              <w:rPr>
+                <w:b/>
+              </w:rPr>
+              <w:t>Testing</w:t>
+            </w:r>
+          </w:p>
+        </w:tc>
+        <w:tc>
+          <w:tcPr>
+            <w:tcW w:type="dxa" w:w="4320"/>
+          </w:tcPr>
+          <w:p>
+            <w:r>
+              <w:t>110 unit + integration tests covering edge cases</w:t>
+            </w:r>
+          </w:p>
+        </w:tc>
+      </w:tr>
+      <w:tr>
+        <w:tc>
+          <w:tcPr>
+            <w:tcW w:type="dxa" w:w="4320"/>
+          </w:tcPr>
+          <w:p>
+            <w:r>
+              <w:rPr>
+                <w:b/>
+              </w:rPr>
+              <w:t>Code</w:t>
+            </w:r>
+          </w:p>
+        </w:tc>
+        <w:tc>
+          <w:tcPr>
+            <w:tcW w:type="dxa" w:w="4320"/>
+          </w:tcPr>
+          <w:p>
+            <w:r>
+              <w:t>2,982 lines (production + tests)</w:t>
             </w:r>
           </w:p>
         </w:tc>
@@ -404,7 +445,65 @@
     </w:p>
     <w:p>
       <w:r>
-        <w:t>The system follows a layered architecture with clear separation of concerns:</w:t>
+        <w:rPr>
+          <w:rFonts w:ascii="Courier New" w:hAnsi="Courier New"/>
+          <w:sz w:val="16"/>
+        </w:rPr>
+        <w:br/>
+        <w:t>┌─────────────────────────────────────────────────────┐</w:t>
+        <w:br/>
+        <w:t>│              Frontend (Next.js 14)                   │</w:t>
+        <w:br/>
+        <w:t>│   GeneratePanel │ ArtifactViewer │ ReviewPanel      │</w:t>
+        <w:br/>
+        <w:t>└────────────────────────┬────────────────────────────┘</w:t>
+        <w:br/>
+        <w:t xml:space="preserve">                         │ REST API (JSON + Pydantic)</w:t>
+        <w:br/>
+        <w:t xml:space="preserve">                         ▼</w:t>
+        <w:br/>
+        <w:t>┌─────────────────────────────────────────────────────┐</w:t>
+        <w:br/>
+        <w:t>│              Backend (FastAPI)                       │</w:t>
+        <w:br/>
+        <w:t>│                                                     │</w:t>
+        <w:br/>
+        <w:t>│  Config ─── Logger ─── LRU Store (max 100)         │</w:t>
+        <w:br/>
+        <w:t>│                                                     │</w:t>
+        <w:br/>
+        <w:t>│  ┌─────────── Agent Pipeline ──────────────────┐   │</w:t>
+        <w:br/>
+        <w:t>│  │ Digester → Planner → Writer → Reviewer      │   │</w:t>
+        <w:br/>
+        <w:t>│  │ (retry=3)  (retry=3) (retry=3) (retry=3)    │   │</w:t>
+        <w:br/>
+        <w:t>│  │                                              │   │</w:t>
+        <w:br/>
+        <w:t>│  │ Each agent: call_llm_with_retry()            │   │</w:t>
+        <w:br/>
+        <w:t>│  │   ├─ Exponential backoff on 429              │   │</w:t>
+        <w:br/>
+        <w:t>│  │   ├─ Retry on timeout/5xx                    │   │</w:t>
+        <w:br/>
+        <w:t>│  │   ├─ JSON parse validation                   │   │</w:t>
+        <w:br/>
+        <w:t>│  │   └─ Output schema enforcement               │   │</w:t>
+        <w:br/>
+        <w:t>│  └──────────────────────────────────────────────┘   │</w:t>
+        <w:br/>
+        <w:t>│                                                     │</w:t>
+        <w:br/>
+        <w:t>│  ┌──────────┐  ┌───────────────┐  ┌────────────┐  │</w:t>
+        <w:br/>
+        <w:t>│  │Connectors│  │RAG Pipeline   │  │ Evaluation │  │</w:t>
+        <w:br/>
+        <w:t>│  │ +fallback│  │ +hash caching │  │ 4 metrics  │  │</w:t>
+        <w:br/>
+        <w:t>│  └──────────┘  └───────────────┘  └────────────┘  │</w:t>
+        <w:br/>
+        <w:t>└─────────────────────────────────────────────────────┘</w:t>
+        <w:br/>
       </w:r>
     </w:p>
     <w:p>
@@ -420,10 +519,10 @@
         <w:rPr>
           <w:b/>
         </w:rPr>
-        <w:t xml:space="preserve">Presentation Layer: </w:t>
+        <w:t xml:space="preserve">Presentation: </w:t>
       </w:r>
       <w:r>
-        <w:t>Next.js 14 React application with Tailwind CSS. Provides generate, view, edit, and approve workflows.</w:t>
+        <w:t>Next.js 14, React 18, Tailwind CSS. Tabbed UI with edit/approve flow.</w:t>
       </w:r>
     </w:p>
     <w:p>
@@ -431,10 +530,10 @@
         <w:rPr>
           <w:b/>
         </w:rPr>
-        <w:t xml:space="preserve">API Layer: </w:t>
+        <w:t xml:space="preserve">API: </w:t>
       </w:r>
       <w:r>
-        <w:t>FastAPI REST endpoints with CORS, Pydantic validation, and JSON responses.</w:t>
+        <w:t>FastAPI with Pydantic validation (min/max length), CORS, proper HTTP status codes.</w:t>
       </w:r>
     </w:p>
     <w:p>
@@ -442,10 +541,10 @@
         <w:rPr>
           <w:b/>
         </w:rPr>
-        <w:t xml:space="preserve">Orchestration Layer: </w:t>
+        <w:t xml:space="preserve">Orchestration: </w:t>
       </w:r>
       <w:r>
-        <w:t>Sequential agent pipeline coordinator. Manages data flow between agents.</w:t>
+        <w:t>Sequential pipeline with per-stage error handling. AgentError propagates as 502.</w:t>
       </w:r>
     </w:p>
     <w:p>
@@ -453,10 +552,10 @@
         <w:rPr>
           <w:b/>
         </w:rPr>
-        <w:t xml:space="preserve">Agent Layer: </w:t>
+        <w:t xml:space="preserve">Agent: </w:t>
       </w:r>
       <w:r>
-        <w:t>Four stateless AI agents, each with focused responsibilities and structured JSON output.</w:t>
+        <w:t>4 stateless agents. Each uses call_llm_with_retry() with JSON mode + output validation.</w:t>
       </w:r>
     </w:p>
     <w:p>
@@ -464,97 +563,10 @@
         <w:rPr>
           <w:b/>
         </w:rPr>
-        <w:t xml:space="preserve">Data Layer: </w:t>
+        <w:t xml:space="preserve">Data: </w:t>
       </w:r>
       <w:r>
-        <w:t>Connectors (GitHub, Jira, Docs), RAG index (JSON + NumPy), in-memory release store.</w:t>
-      </w:r>
-    </w:p>
-    <w:p>
-      <w:r>
-        <w:rPr>
-          <w:b/>
-        </w:rPr>
-        <w:t xml:space="preserve">External Services: </w:t>
-      </w:r>
-      <w:r>
-        <w:t>OpenAI API for chat completions and embeddings.</w:t>
-      </w:r>
-    </w:p>
-    <w:p>
-      <w:pPr>
-        <w:pStyle w:val="Heading2"/>
-      </w:pPr>
-      <w:r>
-        <w:t>System Diagram</w:t>
-      </w:r>
-    </w:p>
-    <w:p>
-      <w:r>
-        <w:t>The following illustrates the high-level component interaction:</w:t>
-      </w:r>
-    </w:p>
-    <w:p>
-      <w:r>
-        <w:rPr>
-          <w:rFonts w:ascii="Courier New" w:hAnsi="Courier New"/>
-          <w:sz w:val="16"/>
-        </w:rPr>
-        <w:br/>
-        <w:t>┌─────────────────────────────────────────────────────┐</w:t>
-        <w:br/>
-        <w:t>│              Frontend (Next.js 14)                   │</w:t>
-        <w:br/>
-        <w:t>│   GeneratePanel │ ArtifactViewer │ ReviewPanel      │</w:t>
-        <w:br/>
-        <w:t>└────────────────────────┬────────────────────────────┘</w:t>
-        <w:br/>
-        <w:t xml:space="preserve">                         │ REST API (JSON)</w:t>
-        <w:br/>
-        <w:t xml:space="preserve">                         ▼</w:t>
-        <w:br/>
-        <w:t>┌─────────────────────────────────────────────────────┐</w:t>
-        <w:br/>
-        <w:t>│              Backend (FastAPI)                       │</w:t>
-        <w:br/>
-        <w:t>│                                                     │</w:t>
-        <w:br/>
-        <w:t>│   ┌─────────── Agent Pipeline ───────────────────┐  │</w:t>
-        <w:br/>
-        <w:t>│   │ Digester → Planner → Writer → Reviewer       │  │</w:t>
-        <w:br/>
-        <w:t>│   └──────────────────────────────────────────────┘  │</w:t>
-        <w:br/>
-        <w:t>│                                                     │</w:t>
-        <w:br/>
-        <w:t>│   ┌──────────┐  ┌───────────┐  ┌──────────────┐   │</w:t>
-        <w:br/>
-        <w:t>│   │Connectors│  │RAG Pipeline│  │  Evaluation  │   │</w:t>
-        <w:br/>
-        <w:t>│   │GitHub    │  │Indexer     │  │  Framework   │   │</w:t>
-        <w:br/>
-        <w:t>│   │Jira      │  │Retriever   │  │              │   │</w:t>
-        <w:br/>
-        <w:t>│   │Docs      │  │VectorStore │  │              │   │</w:t>
-        <w:br/>
-        <w:t>│   └──────────┘  └───────────┘  └──────────────┘   │</w:t>
-        <w:br/>
-        <w:t>└─────────────────────────────────────────────────────┘</w:t>
-        <w:br/>
-        <w:t xml:space="preserve">                         │</w:t>
-        <w:br/>
-        <w:t xml:space="preserve">                         ▼</w:t>
-        <w:br/>
-        <w:t xml:space="preserve">              ┌─────────────────────┐</w:t>
-        <w:br/>
-        <w:t xml:space="preserve">              │    OpenAI API       │</w:t>
-        <w:br/>
-        <w:t xml:space="preserve">              │  GPT-4o-mini        │</w:t>
-        <w:br/>
-        <w:t xml:space="preserve">              │  text-embedding-3   │</w:t>
-        <w:br/>
-        <w:t xml:space="preserve">              └─────────────────────┘</w:t>
-        <w:br/>
+        <w:t>Connectors (graceful file loading), RAG (content-hash cache), LRU store (max 100 releases).</w:t>
       </w:r>
     </w:p>
     <w:p>
@@ -572,28 +584,71 @@
     </w:p>
     <w:p>
       <w:r>
-        <w:t>The core of the system is a sequential multi-agent pipeline. Each agent is a stateless function that takes structured input and an OpenAI client, returning a JSON object. This design enables independent testing, debugging, and improvement of each stage.</w:t>
+        <w:t>Each agent is hardened with:</w:t>
       </w:r>
     </w:p>
     <w:p>
       <w:pPr>
-        <w:pStyle w:val="Heading2"/>
+        <w:pStyle w:val="ListBullet"/>
       </w:pPr>
       <w:r>
-        <w:t>Pipeline Sequence</w:t>
+        <w:t>Retry with exponential backoff (max 3 attempts, max 30s wait)</w:t>
       </w:r>
     </w:p>
     <w:p>
+      <w:pPr>
+        <w:pStyle w:val="ListBullet"/>
+      </w:pPr>
       <w:r>
-        <w:t>1. Digester Agent receives raw commits, PRs, and tickets. Produces a structured summary.</w:t>
-        <w:br/>
-        <w:t>2. Planner Agent receives the digest + existing documentation list. Produces a documentation plan.</w:t>
-        <w:br/>
-        <w:t>3. RAG Retriever fetches relevant document chunks based on the digest.</w:t>
-        <w:br/>
-        <w:t>4. Writer Agent receives digest + plan + RAG chunks. Produces all documentation artifacts.</w:t>
-        <w:br/>
-        <w:t>5. Reviewer Agent receives generated output + original source evidence. Validates quality.</w:t>
+        <w:t>Rate limit handling (429 → exponential backoff)</w:t>
+      </w:r>
+    </w:p>
+    <w:p>
+      <w:pPr>
+        <w:pStyle w:val="ListBullet"/>
+      </w:pPr>
+      <w:r>
+        <w:t>Timeout handling (configurable, default 60s)</w:t>
+      </w:r>
+    </w:p>
+    <w:p>
+      <w:pPr>
+        <w:pStyle w:val="ListBullet"/>
+      </w:pPr>
+      <w:r>
+        <w:t>JSON parse validation (retry on malformed response)</w:t>
+      </w:r>
+    </w:p>
+    <w:p>
+      <w:pPr>
+        <w:pStyle w:val="ListBullet"/>
+      </w:pPr>
+      <w:r>
+        <w:t>Empty response detection and retry</w:t>
+      </w:r>
+    </w:p>
+    <w:p>
+      <w:pPr>
+        <w:pStyle w:val="ListBullet"/>
+      </w:pPr>
+      <w:r>
+        <w:t>Output schema enforcement (missing fields get defaults)</w:t>
+      </w:r>
+    </w:p>
+    <w:p>
+      <w:pPr>
+        <w:pStyle w:val="ListBullet"/>
+      </w:pPr>
+      <w:r>
+        <w:t>Input truncation (prevents context overflow)</w:t>
+      </w:r>
+    </w:p>
+    <w:p>
+      <w:pPr>
+        <w:pStyle w:val="ListBullet"/>
+      </w:pPr>
+      <w:r>
+        <w:t>Graceful degradation (empty input → minimal valid output)</w:t>
       </w:r>
     </w:p>
     <w:p>
@@ -640,32 +695,6 @@
               <w:rPr>
                 <w:b/>
               </w:rPr>
-              <w:t>Input</w:t>
-            </w:r>
-          </w:p>
-        </w:tc>
-        <w:tc>
-          <w:tcPr>
-            <w:tcW w:type="dxa" w:w="1728"/>
-          </w:tcPr>
-          <w:p>
-            <w:r>
-              <w:rPr>
-                <w:b/>
-              </w:rPr>
-              <w:t>Output</w:t>
-            </w:r>
-          </w:p>
-        </w:tc>
-        <w:tc>
-          <w:tcPr>
-            <w:tcW w:type="dxa" w:w="1728"/>
-          </w:tcPr>
-          <w:p>
-            <w:r>
-              <w:rPr>
-                <w:b/>
-              </w:rPr>
               <w:t>Temperature</w:t>
             </w:r>
           </w:p>
@@ -679,7 +708,33 @@
               <w:rPr>
                 <w:b/>
               </w:rPr>
-              <w:t>Purpose</w:t>
+              <w:t>Output Validation</w:t>
+            </w:r>
+          </w:p>
+        </w:tc>
+        <w:tc>
+          <w:tcPr>
+            <w:tcW w:type="dxa" w:w="1728"/>
+          </w:tcPr>
+          <w:p>
+            <w:r>
+              <w:rPr>
+                <w:b/>
+              </w:rPr>
+              <w:t>Edge Cases Handled</w:t>
+            </w:r>
+          </w:p>
+        </w:tc>
+        <w:tc>
+          <w:tcPr>
+            <w:tcW w:type="dxa" w:w="1728"/>
+          </w:tcPr>
+          <w:p>
+            <w:r>
+              <w:rPr>
+                <w:b/>
+              </w:rPr>
+              <w:t>Lines</w:t>
             </w:r>
           </w:p>
         </w:tc>
@@ -701,26 +756,6 @@
           </w:tcPr>
           <w:p>
             <w:r>
-              <w:t>Commits, PRs, Tickets</w:t>
-            </w:r>
-          </w:p>
-        </w:tc>
-        <w:tc>
-          <w:tcPr>
-            <w:tcW w:type="dxa" w:w="1728"/>
-          </w:tcPr>
-          <w:p>
-            <w:r>
-              <w:t>features[], bug_fixes[], breaking_changes[], affected_systems[], risk_level, summary</w:t>
-            </w:r>
-          </w:p>
-        </w:tc>
-        <w:tc>
-          <w:tcPr>
-            <w:tcW w:type="dxa" w:w="1728"/>
-          </w:tcPr>
-          <w:p>
-            <w:r>
               <w:t>0.1</w:t>
             </w:r>
           </w:p>
@@ -731,7 +766,27 @@
           </w:tcPr>
           <w:p>
             <w:r>
-              <w:t>Extract structured signal from raw artifacts</w:t>
+              <w:t>risk_level normalization, list coercion, defaults</w:t>
+            </w:r>
+          </w:p>
+        </w:tc>
+        <w:tc>
+          <w:tcPr>
+            <w:tcW w:type="dxa" w:w="1728"/>
+          </w:tcPr>
+          <w:p>
+            <w:r>
+              <w:t>Empty inputs, missing fields, long descriptions</w:t>
+            </w:r>
+          </w:p>
+        </w:tc>
+        <w:tc>
+          <w:tcPr>
+            <w:tcW w:type="dxa" w:w="1728"/>
+          </w:tcPr>
+          <w:p>
+            <w:r>
+              <w:t>155</w:t>
             </w:r>
           </w:p>
         </w:tc>
@@ -753,26 +808,6 @@
           </w:tcPr>
           <w:p>
             <w:r>
-              <w:t>Digest, Existing Docs</w:t>
-            </w:r>
-          </w:p>
-        </w:tc>
-        <w:tc>
-          <w:tcPr>
-            <w:tcW w:type="dxa" w:w="1728"/>
-          </w:tcPr>
-          <w:p>
-            <w:r>
-              <w:t>changelog_plan, internal_notes_plan, customer_notes_plan, doc_update_plan[]</w:t>
-            </w:r>
-          </w:p>
-        </w:tc>
-        <w:tc>
-          <w:tcPr>
-            <w:tcW w:type="dxa" w:w="1728"/>
-          </w:tcPr>
-          <w:p>
-            <w:r>
               <w:t>0.2</w:t>
             </w:r>
           </w:p>
@@ -783,7 +818,27 @@
           </w:tcPr>
           <w:p>
             <w:r>
-              <w:t>Decide what to write and how to structure it</w:t>
+              <w:t>Action enum validation, plan structure</w:t>
+            </w:r>
+          </w:p>
+        </w:tc>
+        <w:tc>
+          <w:tcPr>
+            <w:tcW w:type="dxa" w:w="1728"/>
+          </w:tcPr>
+          <w:p>
+            <w:r>
+              <w:t>Empty digest, no existing docs, huge corpora</w:t>
+            </w:r>
+          </w:p>
+        </w:tc>
+        <w:tc>
+          <w:tcPr>
+            <w:tcW w:type="dxa" w:w="1728"/>
+          </w:tcPr>
+          <w:p>
+            <w:r>
+              <w:t>161</w:t>
             </w:r>
           </w:p>
         </w:tc>
@@ -805,26 +860,6 @@
           </w:tcPr>
           <w:p>
             <w:r>
-              <w:t>Digest, Plan, RAG Chunks</w:t>
-            </w:r>
-          </w:p>
-        </w:tc>
-        <w:tc>
-          <w:tcPr>
-            <w:tcW w:type="dxa" w:w="1728"/>
-          </w:tcPr>
-          <w:p>
-            <w:r>
-              <w:t>changelog, internal_release_notes, customer_release_notes, documentation_updates[]</w:t>
-            </w:r>
-          </w:p>
-        </w:tc>
-        <w:tc>
-          <w:tcPr>
-            <w:tcW w:type="dxa" w:w="1728"/>
-          </w:tcPr>
-          <w:p>
-            <w:r>
               <w:t>0.3</w:t>
             </w:r>
           </w:p>
@@ -835,7 +870,27 @@
           </w:tcPr>
           <w:p>
             <w:r>
-              <w:t>Generate polished documentation content</w:t>
+              <w:t>doc_update structure, required fields</w:t>
+            </w:r>
+          </w:p>
+        </w:tc>
+        <w:tc>
+          <w:tcPr>
+            <w:tcW w:type="dxa" w:w="1728"/>
+          </w:tcPr>
+          <w:p>
+            <w:r>
+              <w:t>Empty digest, no RAG context, huge plans</w:t>
+            </w:r>
+          </w:p>
+        </w:tc>
+        <w:tc>
+          <w:tcPr>
+            <w:tcW w:type="dxa" w:w="1728"/>
+          </w:tcPr>
+          <w:p>
+            <w:r>
+              <w:t>124</w:t>
             </w:r>
           </w:p>
         </w:tc>
@@ -857,26 +912,6 @@
           </w:tcPr>
           <w:p>
             <w:r>
-              <w:t>Generated Docs, Digest, Original Artifacts</w:t>
-            </w:r>
-          </w:p>
-        </w:tc>
-        <w:tc>
-          <w:tcPr>
-            <w:tcW w:type="dxa" w:w="1728"/>
-          </w:tcPr>
-          <w:p>
-            <w:r>
-              <w:t>overall_score, hallucination_issues[], missing_coverage[], suggestions[], approved</w:t>
-            </w:r>
-          </w:p>
-        </w:tc>
-        <w:tc>
-          <w:tcPr>
-            <w:tcW w:type="dxa" w:w="1728"/>
-          </w:tcPr>
-          <w:p>
-            <w:r>
               <w:t>0.1</w:t>
             </w:r>
           </w:p>
@@ -887,7 +922,27 @@
           </w:tcPr>
           <w:p>
             <w:r>
-              <w:t>Quality gate; validates against source</w:t>
+              <w:t>Score clamping 1-10, boolean coercion, approval logic</w:t>
+            </w:r>
+          </w:p>
+        </w:tc>
+        <w:tc>
+          <w:tcPr>
+            <w:tcW w:type="dxa" w:w="1728"/>
+          </w:tcPr>
+          <w:p>
+            <w:r>
+              <w:t>Empty docs, hallucination enforcement</w:t>
+            </w:r>
+          </w:p>
+        </w:tc>
+        <w:tc>
+          <w:tcPr>
+            <w:tcW w:type="dxa" w:w="1728"/>
+          </w:tcPr>
+          <w:p>
+            <w:r>
+              <w:t>143</w:t>
             </w:r>
           </w:p>
         </w:tc>
@@ -898,47 +953,22 @@
         <w:pStyle w:val="Heading2"/>
       </w:pPr>
       <w:r>
-        <w:t>Prompt Design Principles</w:t>
+        <w:t>Retry Logic (base.py)</w:t>
       </w:r>
     </w:p>
     <w:p>
-      <w:pPr>
-        <w:pStyle w:val="ListBullet"/>
-      </w:pPr>
       <w:r>
-        <w:t>System prompts define the agent role, expected output schema, and constraints</w:t>
-      </w:r>
-    </w:p>
-    <w:p>
-      <w:pPr>
-        <w:pStyle w:val="ListBullet"/>
-      </w:pPr>
-      <w:r>
-        <w:t>JSON response mode ensures structured, parseable output (no regex parsing needed)</w:t>
-      </w:r>
-    </w:p>
-    <w:p>
-      <w:pPr>
-        <w:pStyle w:val="ListBullet"/>
-      </w:pPr>
-      <w:r>
-        <w:t>Low temperature (0.1-0.3) prioritizes factual accuracy over creative variation</w:t>
-      </w:r>
-    </w:p>
-    <w:p>
-      <w:pPr>
-        <w:pStyle w:val="ListBullet"/>
-      </w:pPr>
-      <w:r>
-        <w:t>Anti-hallucination instruction: "Only include facts supported by source evidence"</w:t>
-      </w:r>
-    </w:p>
-    <w:p>
-      <w:pPr>
-        <w:pStyle w:val="ListBullet"/>
-      </w:pPr>
-      <w:r>
-        <w:t>Explicit output schemas in system prompts guide model structure compliance</w:t>
+        <w:t>All LLM calls go through call_llm_with_retry() which implements:</w:t>
+        <w:br/>
+        <w:t>1. Exponential backoff: wait = min(2^attempt, 30) seconds on rate limit</w:t>
+        <w:br/>
+        <w:t>2. Timeout retry: 2s pause then retry on APITimeoutError</w:t>
+        <w:br/>
+        <w:t>3. Client error abort: 4xx errors (except 429) raise immediately</w:t>
+        <w:br/>
+        <w:t>4. JSON validation: retry if response is not valid JSON</w:t>
+        <w:br/>
+        <w:t>5. Empty response: raise AgentError after all retries exhausted</w:t>
       </w:r>
     </w:p>
     <w:p>
@@ -955,8 +985,67 @@
       </w:r>
     </w:p>
     <w:p>
+      <w:pPr>
+        <w:pStyle w:val="Heading2"/>
+      </w:pPr>
       <w:r>
-        <w:t>The RAG (Retrieval-Augmented Generation) pipeline provides relevant context from existing documentation to the Writer agent. This grounds generation in real documentation and enables accurate "documentation update suggestions."</w:t>
+        <w:t>Indexing (276 lines)</w:t>
+      </w:r>
+    </w:p>
+    <w:p>
+      <w:pPr>
+        <w:pStyle w:val="ListBullet"/>
+      </w:pPr>
+      <w:r>
+        <w:t>Content-hash caching: skip rebuild if documents unchanged (SHA-256 hash of all content)</w:t>
+      </w:r>
+    </w:p>
+    <w:p>
+      <w:pPr>
+        <w:pStyle w:val="ListBullet"/>
+      </w:pPr>
+      <w:r>
+        <w:t>Section-aware chunking: split by markdown headings, then by word count with overlap</w:t>
+      </w:r>
+    </w:p>
+    <w:p>
+      <w:pPr>
+        <w:pStyle w:val="ListBullet"/>
+      </w:pPr>
+      <w:r>
+        <w:t>Batch embedding: groups of 50 with per-batch retry</w:t>
+      </w:r>
+    </w:p>
+    <w:p>
+      <w:pPr>
+        <w:pStyle w:val="ListBullet"/>
+      </w:pPr>
+      <w:r>
+        <w:t>Corruption recovery: validates index on load (field presence, count matching)</w:t>
+      </w:r>
+    </w:p>
+    <w:p>
+      <w:pPr>
+        <w:pStyle w:val="ListBullet"/>
+      </w:pPr>
+      <w:r>
+        <w:t>Fallback: zero vectors returned if embedding API fails (allows graceful degradation)</w:t>
+      </w:r>
+    </w:p>
+    <w:p>
+      <w:pPr>
+        <w:pStyle w:val="ListBullet"/>
+      </w:pPr>
+      <w:r>
+        <w:t>Empty document handling: skips files with no content, logs warning</w:t>
+      </w:r>
+    </w:p>
+    <w:p>
+      <w:pPr>
+        <w:pStyle w:val="ListBullet"/>
+      </w:pPr>
+      <w:r>
+        <w:t>Unicode safety: uses errors="replace" for non-UTF8 content</w:t>
       </w:r>
     </w:p>
     <w:p>
@@ -964,138 +1053,47 @@
         <w:pStyle w:val="Heading2"/>
       </w:pPr>
       <w:r>
-        <w:t>Indexing Process</w:t>
-      </w:r>
-    </w:p>
-    <w:p>
-      <w:r>
-        <w:rPr>
-          <w:b/>
-        </w:rPr>
-        <w:t xml:space="preserve">Document Loading: </w:t>
-      </w:r>
-      <w:r>
-        <w:t>Markdown files are loaded from the docs directory with path and title metadata.</w:t>
-      </w:r>
-    </w:p>
-    <w:p>
-      <w:r>
-        <w:rPr>
-          <w:b/>
-        </w:rPr>
-        <w:t xml:space="preserve">Section Splitting: </w:t>
-      </w:r>
-      <w:r>
-        <w:t>Documents are split by markdown headings (##, ###) to preserve semantic boundaries.</w:t>
-      </w:r>
-    </w:p>
-    <w:p>
-      <w:r>
-        <w:rPr>
-          <w:b/>
-        </w:rPr>
-        <w:t xml:space="preserve">Overlap Chunking: </w:t>
-      </w:r>
-      <w:r>
-        <w:t>Sections exceeding 500 words are split into overlapping chunks (100-word overlap) to maintain context across boundaries.</w:t>
-      </w:r>
-    </w:p>
-    <w:p>
-      <w:r>
-        <w:rPr>
-          <w:b/>
-        </w:rPr>
-        <w:t xml:space="preserve">Embedding: </w:t>
-      </w:r>
-      <w:r>
-        <w:t>Each chunk is embedded using OpenAI text-embedding-3-small (1536 dimensions). Batched in groups of 100.</w:t>
-      </w:r>
-    </w:p>
-    <w:p>
-      <w:r>
-        <w:rPr>
-          <w:b/>
-        </w:rPr>
-        <w:t xml:space="preserve">Storage: </w:t>
-      </w:r>
-      <w:r>
-        <w:t>Chunks + embeddings stored in a JSON file (rag_index.json) for persistence across requests.</w:t>
+        <w:t>Retrieval (102 lines)</w:t>
       </w:r>
     </w:p>
     <w:p>
       <w:pPr>
-        <w:pStyle w:val="Heading2"/>
+        <w:pStyle w:val="ListBullet"/>
       </w:pPr>
       <w:r>
-        <w:t>Retrieval Process</w:t>
-      </w:r>
-    </w:p>
-    <w:p>
-      <w:r>
-        <w:rPr>
-          <w:b/>
-        </w:rPr>
-        <w:t xml:space="preserve">Query Formation: </w:t>
-      </w:r>
-      <w:r>
-        <w:t>Query = digest summary + affected system names (captures both intent and specifics).</w:t>
-      </w:r>
-    </w:p>
-    <w:p>
-      <w:r>
-        <w:rPr>
-          <w:b/>
-        </w:rPr>
-        <w:t xml:space="preserve">Query Embedding: </w:t>
-      </w:r>
-      <w:r>
-        <w:t>Query is embedded using the same model (text-embedding-3-small).</w:t>
-      </w:r>
-    </w:p>
-    <w:p>
-      <w:r>
-        <w:rPr>
-          <w:b/>
-        </w:rPr>
-        <w:t xml:space="preserve">Cosine Similarity: </w:t>
-      </w:r>
-      <w:r>
-        <w:t>Similarity computed between query vector and all chunk vectors using NumPy.</w:t>
-      </w:r>
-    </w:p>
-    <w:p>
-      <w:r>
-        <w:rPr>
-          <w:b/>
-        </w:rPr>
-        <w:t xml:space="preserve">Top-K Selection: </w:t>
-      </w:r>
-      <w:r>
-        <w:t>Top 5 most relevant chunks returned, sorted by descending similarity score.</w:t>
-      </w:r>
-    </w:p>
-    <w:p>
-      <w:r>
-        <w:rPr>
-          <w:b/>
-        </w:rPr>
-        <w:t xml:space="preserve">Score Transparency: </w:t>
-      </w:r>
-      <w:r>
-        <w:t>Relevance scores are passed through to the UI for debugging and trust.</w:t>
+        <w:t>Score thresholding: minimum 0.1 cosine similarity (filters noise)</w:t>
       </w:r>
     </w:p>
     <w:p>
       <w:pPr>
-        <w:pStyle w:val="Heading2"/>
+        <w:pStyle w:val="ListBullet"/>
       </w:pPr>
       <w:r>
-        <w:t>Why Not ChromaDB/Pinecone?</w:t>
+        <w:t>Auto-build: if no index exists, builds on demand from documents</w:t>
       </w:r>
     </w:p>
     <w:p>
+      <w:pPr>
+        <w:pStyle w:val="ListBullet"/>
+      </w:pPr>
       <w:r>
-        <w:t>For a documentation corpus of typical size (&lt;1000 chunks), a simple NumPy cosine similarity search is fast (&lt;50ms), requires zero infrastructure, and avoids heavy dependencies. ChromaDB pulls onnxruntime and torch; Pinecone requires a cloud account. The JSON+NumPy approach keeps the system single-binary deployable. Switch to pgvector or Pinecone when the corpus exceeds 10,000 documents.</w:t>
+        <w:t>Empty query guard: returns [] for blank queries</w:t>
+      </w:r>
+    </w:p>
+    <w:p>
+      <w:pPr>
+        <w:pStyle w:val="ListBullet"/>
+      </w:pPr>
+      <w:r>
+        <w:t>Zero-vector handling: returns 0.0 similarity (not NaN)</w:t>
+      </w:r>
+    </w:p>
+    <w:p>
+      <w:pPr>
+        <w:pStyle w:val="ListBullet"/>
+      </w:pPr>
+      <w:r>
+        <w:t>Top-K with cutoff: stops early when scores drop below threshold</w:t>
       </w:r>
     </w:p>
     <w:p>
@@ -1113,15 +1111,7 @@
     </w:p>
     <w:p>
       <w:r>
-        <w:t>The evaluation framework measures generated documentation quality using three automated metrics. No additional LLM calls are required; evaluation uses the Reviewer agent output and deterministic string matching.</w:t>
-      </w:r>
-    </w:p>
-    <w:p>
-      <w:pPr>
-        <w:pStyle w:val="Heading2"/>
-      </w:pPr>
-      <w:r>
-        <w:t>Metrics</w:t>
+        <w:t>Four automated metrics, no additional LLM calls required:</w:t>
       </w:r>
     </w:p>
     <w:tbl>
@@ -1159,7 +1149,7 @@
               <w:rPr>
                 <w:b/>
               </w:rPr>
-              <w:t>How Measured</w:t>
+              <w:t>Weight</w:t>
             </w:r>
           </w:p>
         </w:tc>
@@ -1185,7 +1175,7 @@
               <w:rPr>
                 <w:b/>
               </w:rPr>
-              <w:t>Target</w:t>
+              <w:t>Edge Cases</w:t>
             </w:r>
           </w:p>
         </w:tc>
@@ -1207,7 +1197,7 @@
           </w:tcPr>
           <w:p>
             <w:r>
-              <w:t>Reviewer agent flags unsupported claims</w:t>
+              <w:t>35%</w:t>
             </w:r>
           </w:p>
         </w:tc>
@@ -1217,7 +1207,7 @@
           </w:tcPr>
           <w:p>
             <w:r>
-              <w:t>min(1.0, issue_count × 0.1)</w:t>
+              <w:t>min(1.0, issues * 0.1)</w:t>
             </w:r>
           </w:p>
         </w:tc>
@@ -1227,7 +1217,7 @@
           </w:tcPr>
           <w:p>
             <w:r>
-              <w:t>&lt; 10%</w:t>
+              <w:t>None review = 0.5, non-list = 0.0</w:t>
             </w:r>
           </w:p>
         </w:tc>
@@ -1249,7 +1239,7 @@
           </w:tcPr>
           <w:p>
             <w:r>
-              <w:t>String match: ticket keys in generated text</w:t>
+              <w:t>30%</w:t>
             </w:r>
           </w:p>
         </w:tc>
@@ -1259,7 +1249,7 @@
           </w:tcPr>
           <w:p>
             <w:r>
-              <w:t>mentioned_keys / total_keys</w:t>
+              <w:t>mentioned / total</w:t>
             </w:r>
           </w:p>
         </w:tc>
@@ -1269,7 +1259,7 @@
           </w:tcPr>
           <w:p>
             <w:r>
-              <w:t>&gt; 90%</w:t>
+              <w:t>No tickets = 1.0, case-insensitive, checks doc_updates too</w:t>
             </w:r>
           </w:p>
         </w:tc>
@@ -1281,7 +1271,7 @@
           </w:tcPr>
           <w:p>
             <w:r>
-              <w:t>Doc Recommendation Accuracy</w:t>
+              <w:t>Doc Accuracy</w:t>
             </w:r>
           </w:p>
         </w:tc>
@@ -1291,7 +1281,7 @@
           </w:tcPr>
           <w:p>
             <w:r>
-              <w:t>Verify suggested doc paths exist in corpus</w:t>
+              <w:t>15%</w:t>
             </w:r>
           </w:p>
         </w:tc>
@@ -1301,7 +1291,7 @@
           </w:tcPr>
           <w:p>
             <w:r>
-              <w:t>valid_recs / total_recs</w:t>
+              <w:t>valid_recs / total</w:t>
             </w:r>
           </w:p>
         </w:tc>
@@ -1311,28 +1301,500 @@
           </w:tcPr>
           <w:p>
             <w:r>
-              <w:t>&gt; 80%</w:t>
+              <w:t>No updates = 0.5, "add" always valid, fuzzy path match</w:t>
+            </w:r>
+          </w:p>
+        </w:tc>
+      </w:tr>
+      <w:tr>
+        <w:tc>
+          <w:tcPr>
+            <w:tcW w:type="dxa" w:w="2160"/>
+          </w:tcPr>
+          <w:p>
+            <w:r>
+              <w:t>Content Quality</w:t>
+            </w:r>
+          </w:p>
+        </w:tc>
+        <w:tc>
+          <w:tcPr>
+            <w:tcW w:type="dxa" w:w="2160"/>
+          </w:tcPr>
+          <w:p>
+            <w:r>
+              <w:t>20%</w:t>
+            </w:r>
+          </w:p>
+        </w:tc>
+        <w:tc>
+          <w:tcPr>
+            <w:tcW w:type="dxa" w:w="2160"/>
+          </w:tcPr>
+          <w:p>
+            <w:r>
+              <w:t>avg(structure checks)</w:t>
+            </w:r>
+          </w:p>
+        </w:tc>
+        <w:tc>
+          <w:tcPr>
+            <w:tcW w:type="dxa" w:w="2160"/>
+          </w:tcPr>
+          <w:p>
+            <w:r>
+              <w:t>Jargon detection, length bounds, heading presence</w:t>
             </w:r>
           </w:p>
         </w:tc>
       </w:tr>
     </w:tbl>
     <w:p>
+      <w:r>
+        <w:br w:type="page"/>
+      </w:r>
+    </w:p>
+    <w:p>
+      <w:pPr>
+        <w:pStyle w:val="Heading1"/>
+      </w:pPr>
+      <w:r>
+        <w:t>6. Error Handling &amp; Resilience</w:t>
+      </w:r>
+    </w:p>
+    <w:tbl>
+      <w:tblPr>
+        <w:tblStyle w:val="LightShading-Accent1"/>
+        <w:tblW w:type="auto" w:w="0"/>
+        <w:tblLook w:firstColumn="1" w:firstRow="1" w:lastColumn="0" w:lastRow="0" w:noHBand="0" w:noVBand="1" w:val="04A0"/>
+      </w:tblPr>
+      <w:tblGrid>
+        <w:gridCol w:w="2880"/>
+        <w:gridCol w:w="2880"/>
+        <w:gridCol w:w="2880"/>
+      </w:tblGrid>
+      <w:tr>
+        <w:tc>
+          <w:tcPr>
+            <w:tcW w:type="dxa" w:w="2880"/>
+          </w:tcPr>
+          <w:p>
+            <w:r>
+              <w:rPr>
+                <w:b/>
+              </w:rPr>
+              <w:t>Scenario</w:t>
+            </w:r>
+          </w:p>
+        </w:tc>
+        <w:tc>
+          <w:tcPr>
+            <w:tcW w:type="dxa" w:w="2880"/>
+          </w:tcPr>
+          <w:p>
+            <w:r>
+              <w:rPr>
+                <w:b/>
+              </w:rPr>
+              <w:t>Handling</w:t>
+            </w:r>
+          </w:p>
+        </w:tc>
+        <w:tc>
+          <w:tcPr>
+            <w:tcW w:type="dxa" w:w="2880"/>
+          </w:tcPr>
+          <w:p>
+            <w:r>
+              <w:rPr>
+                <w:b/>
+              </w:rPr>
+              <w:t>User Impact</w:t>
+            </w:r>
+          </w:p>
+        </w:tc>
+      </w:tr>
+      <w:tr>
+        <w:tc>
+          <w:tcPr>
+            <w:tcW w:type="dxa" w:w="2880"/>
+          </w:tcPr>
+          <w:p>
+            <w:r>
+              <w:t>OPENAI_API_KEY missing</w:t>
+            </w:r>
+          </w:p>
+        </w:tc>
+        <w:tc>
+          <w:tcPr>
+            <w:tcW w:type="dxa" w:w="2880"/>
+          </w:tcPr>
+          <w:p>
+            <w:r>
+              <w:t>HTTP 500 with clear setup instructions</w:t>
+            </w:r>
+          </w:p>
+        </w:tc>
+        <w:tc>
+          <w:tcPr>
+            <w:tcW w:type="dxa" w:w="2880"/>
+          </w:tcPr>
+          <w:p>
+            <w:r>
+              <w:t>Error message guides user to .env</w:t>
+            </w:r>
+          </w:p>
+        </w:tc>
+      </w:tr>
+      <w:tr>
+        <w:tc>
+          <w:tcPr>
+            <w:tcW w:type="dxa" w:w="2880"/>
+          </w:tcPr>
+          <w:p>
+            <w:r>
+              <w:t>OpenAI rate limited (429)</w:t>
+            </w:r>
+          </w:p>
+        </w:tc>
+        <w:tc>
+          <w:tcPr>
+            <w:tcW w:type="dxa" w:w="2880"/>
+          </w:tcPr>
+          <w:p>
+            <w:r>
+              <w:t>Exponential backoff, up to 3 retries</w:t>
+            </w:r>
+          </w:p>
+        </w:tc>
+        <w:tc>
+          <w:tcPr>
+            <w:tcW w:type="dxa" w:w="2880"/>
+          </w:tcPr>
+          <w:p>
+            <w:r>
+              <w:t>Transparent; generation takes longer</w:t>
+            </w:r>
+          </w:p>
+        </w:tc>
+      </w:tr>
+      <w:tr>
+        <w:tc>
+          <w:tcPr>
+            <w:tcW w:type="dxa" w:w="2880"/>
+          </w:tcPr>
+          <w:p>
+            <w:r>
+              <w:t>OpenAI timeout</w:t>
+            </w:r>
+          </w:p>
+        </w:tc>
+        <w:tc>
+          <w:tcPr>
+            <w:tcW w:type="dxa" w:w="2880"/>
+          </w:tcPr>
+          <w:p>
+            <w:r>
+              <w:t>Retry with 2s pause, up to 3 attempts</w:t>
+            </w:r>
+          </w:p>
+        </w:tc>
+        <w:tc>
+          <w:tcPr>
+            <w:tcW w:type="dxa" w:w="2880"/>
+          </w:tcPr>
+          <w:p>
+            <w:r>
+              <w:t>Transparent; generation takes longer</w:t>
+            </w:r>
+          </w:p>
+        </w:tc>
+      </w:tr>
+      <w:tr>
+        <w:tc>
+          <w:tcPr>
+            <w:tcW w:type="dxa" w:w="2880"/>
+          </w:tcPr>
+          <w:p>
+            <w:r>
+              <w:t>OpenAI returns invalid JSON</w:t>
+            </w:r>
+          </w:p>
+        </w:tc>
+        <w:tc>
+          <w:tcPr>
+            <w:tcW w:type="dxa" w:w="2880"/>
+          </w:tcPr>
+          <w:p>
+            <w:r>
+              <w:t>Retry; if persistent, AgentError</w:t>
+            </w:r>
+          </w:p>
+        </w:tc>
+        <w:tc>
+          <w:tcPr>
+            <w:tcW w:type="dxa" w:w="2880"/>
+          </w:tcPr>
+          <w:p>
+            <w:r>
+              <w:t>HTTP 502 with agent name</w:t>
+            </w:r>
+          </w:p>
+        </w:tc>
+      </w:tr>
+      <w:tr>
+        <w:tc>
+          <w:tcPr>
+            <w:tcW w:type="dxa" w:w="2880"/>
+          </w:tcPr>
+          <w:p>
+            <w:r>
+              <w:t>Empty source data</w:t>
+            </w:r>
+          </w:p>
+        </w:tc>
+        <w:tc>
+          <w:tcPr>
+            <w:tcW w:type="dxa" w:w="2880"/>
+          </w:tcPr>
+          <w:p>
+            <w:r>
+              <w:t>Agents return minimal valid output</w:t>
+            </w:r>
+          </w:p>
+        </w:tc>
+        <w:tc>
+          <w:tcPr>
+            <w:tcW w:type="dxa" w:w="2880"/>
+          </w:tcPr>
+          <w:p>
+            <w:r>
+              <w:t>User sees "no significant changes" note</w:t>
+            </w:r>
+          </w:p>
+        </w:tc>
+      </w:tr>
+      <w:tr>
+        <w:tc>
+          <w:tcPr>
+            <w:tcW w:type="dxa" w:w="2880"/>
+          </w:tcPr>
+          <w:p>
+            <w:r>
+              <w:t>RAG index corrupted</w:t>
+            </w:r>
+          </w:p>
+        </w:tc>
+        <w:tc>
+          <w:tcPr>
+            <w:tcW w:type="dxa" w:w="2880"/>
+          </w:tcPr>
+          <w:p>
+            <w:r>
+              <w:t>Detected on load, auto-rebuilds</w:t>
+            </w:r>
+          </w:p>
+        </w:tc>
+        <w:tc>
+          <w:tcPr>
+            <w:tcW w:type="dxa" w:w="2880"/>
+          </w:tcPr>
+          <w:p>
+            <w:r>
+              <w:t>Transparent; first query slightly slower</w:t>
+            </w:r>
+          </w:p>
+        </w:tc>
+      </w:tr>
+      <w:tr>
+        <w:tc>
+          <w:tcPr>
+            <w:tcW w:type="dxa" w:w="2880"/>
+          </w:tcPr>
+          <w:p>
+            <w:r>
+              <w:t>Mock data file missing</w:t>
+            </w:r>
+          </w:p>
+        </w:tc>
+        <w:tc>
+          <w:tcPr>
+            <w:tcW w:type="dxa" w:w="2880"/>
+          </w:tcPr>
+          <w:p>
+            <w:r>
+              <w:t>Connector returns empty list, logs warning</w:t>
+            </w:r>
+          </w:p>
+        </w:tc>
+        <w:tc>
+          <w:tcPr>
+            <w:tcW w:type="dxa" w:w="2880"/>
+          </w:tcPr>
+          <w:p>
+            <w:r>
+              <w:t>Generation proceeds with partial data</w:t>
+            </w:r>
+          </w:p>
+        </w:tc>
+      </w:tr>
+      <w:tr>
+        <w:tc>
+          <w:tcPr>
+            <w:tcW w:type="dxa" w:w="2880"/>
+          </w:tcPr>
+          <w:p>
+            <w:r>
+              <w:t>Release store full (100)</w:t>
+            </w:r>
+          </w:p>
+        </w:tc>
+        <w:tc>
+          <w:tcPr>
+            <w:tcW w:type="dxa" w:w="2880"/>
+          </w:tcPr>
+          <w:p>
+            <w:r>
+              <w:t>LRU eviction of oldest unused release</w:t>
+            </w:r>
+          </w:p>
+        </w:tc>
+        <w:tc>
+          <w:tcPr>
+            <w:tcW w:type="dxa" w:w="2880"/>
+          </w:tcPr>
+          <w:p>
+            <w:r>
+              <w:t>Transparent; old releases auto-removed</w:t>
+            </w:r>
+          </w:p>
+        </w:tc>
+      </w:tr>
+      <w:tr>
+        <w:tc>
+          <w:tcPr>
+            <w:tcW w:type="dxa" w:w="2880"/>
+          </w:tcPr>
+          <w:p>
+            <w:r>
+              <w:t>Approve already-approved</w:t>
+            </w:r>
+          </w:p>
+        </w:tc>
+        <w:tc>
+          <w:tcPr>
+            <w:tcW w:type="dxa" w:w="2880"/>
+          </w:tcPr>
+          <w:p>
+            <w:r>
+              <w:t>HTTP 409 Conflict</w:t>
+            </w:r>
+          </w:p>
+        </w:tc>
+        <w:tc>
+          <w:tcPr>
+            <w:tcW w:type="dxa" w:w="2880"/>
+          </w:tcPr>
+          <w:p>
+            <w:r>
+              <w:t>Frontend shows error message</w:t>
+            </w:r>
+          </w:p>
+        </w:tc>
+      </w:tr>
+    </w:tbl>
+    <w:p>
+      <w:r>
+        <w:br w:type="page"/>
+      </w:r>
+    </w:p>
+    <w:p>
+      <w:pPr>
+        <w:pStyle w:val="Heading1"/>
+      </w:pPr>
+      <w:r>
+        <w:t>7. Frontend Architecture</w:t>
+      </w:r>
+    </w:p>
+    <w:p>
+      <w:r>
+        <w:t>Next.js 14 App Router with React 18 and Tailwind CSS. Single-page application with tabbed interface for reviewing generated documentation.</w:t>
+      </w:r>
+    </w:p>
+    <w:p>
       <w:pPr>
         <w:pStyle w:val="Heading2"/>
       </w:pPr>
       <w:r>
-        <w:t>Overall Score</w:t>
+        <w:t>Components</w:t>
       </w:r>
     </w:p>
     <w:p>
       <w:r>
-        <w:t>Overall Score = (1 - hallucination_rate) × 0.4 + ticket_coverage × 0.35 + doc_accuracy × 0.25</w:t>
+        <w:rPr>
+          <w:b/>
+        </w:rPr>
+        <w:t xml:space="preserve">GeneratePanel: </w:t>
+      </w:r>
+      <w:r>
+        <w:t>Release name input + generate button with loading spinner and pipeline stage indicator</w:t>
       </w:r>
     </w:p>
     <w:p>
       <w:r>
-        <w:t>The weights prioritize factual accuracy (40%) over coverage (35%) and recommendation quality (25%). A release is auto-approved if the Reviewer agent approves AND overall score ≥ 0.7.</w:t>
+        <w:rPr>
+          <w:b/>
+        </w:rPr>
+        <w:t xml:space="preserve">ReleaseCard: </w:t>
+      </w:r>
+      <w:r>
+        <w:t>6-tab interface: Changelog, Internal Notes, Customer Notes, Doc Updates, Evidence, Evaluation</w:t>
+      </w:r>
+    </w:p>
+    <w:p>
+      <w:r>
+        <w:rPr>
+          <w:b/>
+        </w:rPr>
+        <w:t xml:space="preserve">MarkdownPanel: </w:t>
+      </w:r>
+      <w:r>
+        <w:t>Dual-mode: rendered markdown (react-markdown) or textarea editor</w:t>
+      </w:r>
+    </w:p>
+    <w:p>
+      <w:r>
+        <w:rPr>
+          <w:b/>
+        </w:rPr>
+        <w:t xml:space="preserve">EvidencePanel: </w:t>
+      </w:r>
+      <w:r>
+        <w:t>Source traceability: commits, PRs, tickets, RAG chunks with relevance scores</w:t>
+      </w:r>
+    </w:p>
+    <w:p>
+      <w:r>
+        <w:rPr>
+          <w:b/>
+        </w:rPr>
+        <w:t xml:space="preserve">EvaluationPanel: </w:t>
+      </w:r>
+      <w:r>
+        <w:t>Color-coded metric cards (green/yellow/red) + reviewer assessment summary</w:t>
+      </w:r>
+    </w:p>
+    <w:p>
+      <w:pPr>
+        <w:pStyle w:val="Heading2"/>
+      </w:pPr>
+      <w:r>
+        <w:t>Error Handling (Frontend)</w:t>
+      </w:r>
+    </w:p>
+    <w:p>
+      <w:r>
+        <w:t>Network failures show a red error banner with the message. Loading state prevents double-submission. API validation errors (422) display field-level feedback.</w:t>
       </w:r>
     </w:p>
     <w:p>
@@ -1345,159 +1807,7 @@
         <w:pStyle w:val="Heading1"/>
       </w:pPr>
       <w:r>
-        <w:t>6. Frontend Architecture</w:t>
-      </w:r>
-    </w:p>
-    <w:p>
-      <w:r>
-        <w:t>The frontend is a Next.js 14 application using the App Router, React 18, TypeScript, and Tailwind CSS for styling. It provides a single-page experience for generating, reviewing, editing, and approving release documentation.</w:t>
-      </w:r>
-    </w:p>
-    <w:p>
-      <w:pPr>
-        <w:pStyle w:val="Heading2"/>
-      </w:pPr>
-      <w:r>
-        <w:t>Component Hierarchy</w:t>
-      </w:r>
-    </w:p>
-    <w:p>
-      <w:r>
-        <w:rPr>
-          <w:b/>
-        </w:rPr>
-        <w:t xml:space="preserve">layout.tsx: </w:t>
-      </w:r>
-      <w:r>
-        <w:t>Application shell with header and global styles</w:t>
-      </w:r>
-    </w:p>
-    <w:p>
-      <w:r>
-        <w:rPr>
-          <w:b/>
-        </w:rPr>
-        <w:t xml:space="preserve">page.tsx: </w:t>
-      </w:r>
-      <w:r>
-        <w:t>Main page; manages all state (releases[], selectedRelease, loading, error)</w:t>
-      </w:r>
-    </w:p>
-    <w:p>
-      <w:r>
-        <w:rPr>
-          <w:b/>
-        </w:rPr>
-        <w:t xml:space="preserve">GeneratePanel: </w:t>
-      </w:r>
-      <w:r>
-        <w:t>Input form with release name field and Generate button with loading state</w:t>
-      </w:r>
-    </w:p>
-    <w:p>
-      <w:r>
-        <w:rPr>
-          <w:b/>
-        </w:rPr>
-        <w:t xml:space="preserve">ReleaseCard: </w:t>
-      </w:r>
-      <w:r>
-        <w:t>Full release view with tabbed navigation (6 tabs)</w:t>
-      </w:r>
-    </w:p>
-    <w:p>
-      <w:r>
-        <w:rPr>
-          <w:b/>
-        </w:rPr>
-        <w:t xml:space="preserve">  MarkdownPanel: </w:t>
-      </w:r>
-      <w:r>
-        <w:t>Renders markdown content; toggles between view mode (react-markdown) and edit mode (textarea)</w:t>
-      </w:r>
-    </w:p>
-    <w:p>
-      <w:r>
-        <w:rPr>
-          <w:b/>
-        </w:rPr>
-        <w:t xml:space="preserve">  DocUpdatesPanel: </w:t>
-      </w:r>
-      <w:r>
-        <w:t>Cards showing each documentation update suggestion with action badges (add/update/review)</w:t>
-      </w:r>
-    </w:p>
-    <w:p>
-      <w:r>
-        <w:rPr>
-          <w:b/>
-        </w:rPr>
-        <w:t xml:space="preserve">  EvidencePanel: </w:t>
-      </w:r>
-      <w:r>
-        <w:t>Source evidence: commits, PRs, tickets, RAG-retrieved docs with relevance scores</w:t>
-      </w:r>
-    </w:p>
-    <w:p>
-      <w:r>
-        <w:rPr>
-          <w:b/>
-        </w:rPr>
-        <w:t xml:space="preserve">  EvaluationPanel: </w:t>
-      </w:r>
-      <w:r>
-        <w:t>Metric cards (color-coded) + reviewer assessment summary</w:t>
-      </w:r>
-    </w:p>
-    <w:p>
-      <w:pPr>
-        <w:pStyle w:val="Heading2"/>
-      </w:pPr>
-      <w:r>
-        <w:t>User Workflow</w:t>
-      </w:r>
-    </w:p>
-    <w:p>
-      <w:r>
-        <w:t>1. User enters a release name and clicks "Generate"</w:t>
-      </w:r>
-    </w:p>
-    <w:p>
-      <w:r>
-        <w:t>2. Loading state shows pipeline progress (Digest → Plan → Retrieve → Write → Review)</w:t>
-      </w:r>
-    </w:p>
-    <w:p>
-      <w:r>
-        <w:t>3. Results appear in tabbed interface (Changelog, Internal Notes, Customer Notes, Doc Updates, Evidence, Evaluation)</w:t>
-      </w:r>
-    </w:p>
-    <w:p>
-      <w:r>
-        <w:t>4. User can switch to Edit mode to modify any text artifact</w:t>
-      </w:r>
-    </w:p>
-    <w:p>
-      <w:r>
-        <w:t>5. User clicks "Approve" to finalize (with or without edits)</w:t>
-      </w:r>
-    </w:p>
-    <w:p>
-      <w:r>
-        <w:t>6. Release status updates to "approved" with timestamp</w:t>
-      </w:r>
-    </w:p>
-    <w:p>
-      <w:r>
-        <w:br w:type="page"/>
-      </w:r>
-    </w:p>
-    <w:p>
-      <w:pPr>
-        <w:pStyle w:val="Heading1"/>
-      </w:pPr>
-      <w:r>
-        <w:t>7. API Reference</w:t>
+        <w:t>8. API Reference</w:t>
       </w:r>
     </w:p>
     <w:tbl>
@@ -1561,7 +1871,7 @@
               <w:rPr>
                 <w:b/>
               </w:rPr>
-              <w:t>Response</w:t>
+              <w:t>Errors</w:t>
             </w:r>
           </w:p>
         </w:tc>
@@ -1593,7 +1903,7 @@
           </w:tcPr>
           <w:p>
             <w:r>
-              <w:t>Health check</w:t>
+              <w:t>Health + dependency status</w:t>
             </w:r>
           </w:p>
         </w:tc>
@@ -1603,7 +1913,7 @@
           </w:tcPr>
           <w:p>
             <w:r>
-              <w:t>{"status": "ok", "timestamp": "..."}</w:t>
+              <w:t>200 always</w:t>
             </w:r>
           </w:p>
         </w:tc>
@@ -1635,7 +1945,7 @@
           </w:tcPr>
           <w:p>
             <w:r>
-              <w:t>Run full agent pipeline</w:t>
+              <w:t>Full pipeline</w:t>
             </w:r>
           </w:p>
         </w:tc>
@@ -1645,7 +1955,7 @@
           </w:tcPr>
           <w:p>
             <w:r>
-              <w:t>Complete release object (see below)</w:t>
+              <w:t>422 (validation), 500 (config), 502 (agent)</w:t>
             </w:r>
           </w:p>
         </w:tc>
@@ -1677,7 +1987,7 @@
           </w:tcPr>
           <w:p>
             <w:r>
-              <w:t>List all generated releases</w:t>
+              <w:t>List all</w:t>
             </w:r>
           </w:p>
         </w:tc>
@@ -1687,7 +1997,7 @@
           </w:tcPr>
           <w:p>
             <w:r>
-              <w:t>Array of release objects</w:t>
+              <w:t>200</w:t>
             </w:r>
           </w:p>
         </w:tc>
@@ -1719,7 +2029,7 @@
           </w:tcPr>
           <w:p>
             <w:r>
-              <w:t>Get specific release</w:t>
+              <w:t>Get one</w:t>
             </w:r>
           </w:p>
         </w:tc>
@@ -1729,7 +2039,7 @@
           </w:tcPr>
           <w:p>
             <w:r>
-              <w:t>Release object</w:t>
+              <w:t>404</w:t>
             </w:r>
           </w:p>
         </w:tc>
@@ -1761,7 +2071,7 @@
           </w:tcPr>
           <w:p>
             <w:r>
-              <w:t>Approve with optional edits</w:t>
+              <w:t>Approve + edit</w:t>
             </w:r>
           </w:p>
         </w:tc>
@@ -1771,7 +2081,7 @@
           </w:tcPr>
           <w:p>
             <w:r>
-              <w:t>Updated release object</w:t>
+              <w:t>404, 409 (already approved)</w:t>
             </w:r>
           </w:p>
         </w:tc>
@@ -1803,7 +2113,7 @@
           </w:tcPr>
           <w:p>
             <w:r>
-              <w:t>Reject release</w:t>
+              <w:t>Reject</w:t>
             </w:r>
           </w:p>
         </w:tc>
@@ -1813,7 +2123,49 @@
           </w:tcPr>
           <w:p>
             <w:r>
-              <w:t>Updated release object</w:t>
+              <w:t>404, 409 (already approved)</w:t>
+            </w:r>
+          </w:p>
+        </w:tc>
+      </w:tr>
+      <w:tr>
+        <w:tc>
+          <w:tcPr>
+            <w:tcW w:type="dxa" w:w="2160"/>
+          </w:tcPr>
+          <w:p>
+            <w:r>
+              <w:t>DELETE</w:t>
+            </w:r>
+          </w:p>
+        </w:tc>
+        <w:tc>
+          <w:tcPr>
+            <w:tcW w:type="dxa" w:w="2160"/>
+          </w:tcPr>
+          <w:p>
+            <w:r>
+              <w:t>/api/releases/{id}</w:t>
+            </w:r>
+          </w:p>
+        </w:tc>
+        <w:tc>
+          <w:tcPr>
+            <w:tcW w:type="dxa" w:w="2160"/>
+          </w:tcPr>
+          <w:p>
+            <w:r>
+              <w:t>Delete</w:t>
+            </w:r>
+          </w:p>
+        </w:tc>
+        <w:tc>
+          <w:tcPr>
+            <w:tcW w:type="dxa" w:w="2160"/>
+          </w:tcPr>
+          <w:p>
+            <w:r>
+              <w:t>404</w:t>
             </w:r>
           </w:p>
         </w:tc>
@@ -1845,7 +2197,7 @@
           </w:tcPr>
           <w:p>
             <w:r>
-              <w:t>List documentation files</w:t>
+              <w:t>List docs</w:t>
             </w:r>
           </w:p>
         </w:tc>
@@ -1855,7 +2207,7 @@
           </w:tcPr>
           <w:p>
             <w:r>
-              <w:t>Array of {path, title, content}</w:t>
+              <w:t>200</w:t>
             </w:r>
           </w:p>
         </w:tc>
@@ -1877,7 +2229,7 @@
           </w:tcPr>
           <w:p>
             <w:r>
-              <w:t>/api/docs/search?q=...</w:t>
+              <w:t>/api/docs/search?q=</w:t>
             </w:r>
           </w:p>
         </w:tc>
@@ -1887,7 +2239,7 @@
           </w:tcPr>
           <w:p>
             <w:r>
-              <w:t>RAG search over documentation</w:t>
+              <w:t>RAG search</w:t>
             </w:r>
           </w:p>
         </w:tc>
@@ -1897,18 +2249,28 @@
           </w:tcPr>
           <w:p>
             <w:r>
-              <w:t>Array of chunks with scores</w:t>
+              <w:t>422 (empty q), 500 (no key)</w:t>
             </w:r>
           </w:p>
         </w:tc>
       </w:tr>
     </w:tbl>
     <w:p>
+      <w:r>
+        <w:br w:type="page"/>
+      </w:r>
+    </w:p>
+    <w:p>
       <w:pPr>
-        <w:pStyle w:val="Heading2"/>
+        <w:pStyle w:val="Heading1"/>
       </w:pPr>
       <w:r>
-        <w:t>Release Object Schema</w:t>
+        <w:t>9. Testing Strategy</w:t>
+      </w:r>
+    </w:p>
+    <w:p>
+      <w:r>
+        <w:t>110 tests across 6 test files, covering unit tests, integration tests, and edge cases.</w:t>
       </w:r>
     </w:p>
     <w:tbl>
@@ -1932,7 +2294,7 @@
               <w:rPr>
                 <w:b/>
               </w:rPr>
-              <w:t>Field</w:t>
+              <w:t>File</w:t>
             </w:r>
           </w:p>
         </w:tc>
@@ -1945,7 +2307,7 @@
               <w:rPr>
                 <w:b/>
               </w:rPr>
-              <w:t>Type</w:t>
+              <w:t>Tests</w:t>
             </w:r>
           </w:p>
         </w:tc>
@@ -1958,7 +2320,7 @@
               <w:rPr>
                 <w:b/>
               </w:rPr>
-              <w:t>Description</w:t>
+              <w:t>Coverage Focus</w:t>
             </w:r>
           </w:p>
         </w:tc>
@@ -1970,7 +2332,7 @@
           </w:tcPr>
           <w:p>
             <w:r>
-              <w:t>id</w:t>
+              <w:t>test_connectors.py</w:t>
             </w:r>
           </w:p>
         </w:tc>
@@ -1980,7 +2342,7 @@
           </w:tcPr>
           <w:p>
             <w:r>
-              <w:t>string</w:t>
+              <w:t>19</w:t>
             </w:r>
           </w:p>
         </w:tc>
@@ -1990,7 +2352,7 @@
           </w:tcPr>
           <w:p>
             <w:r>
-              <w:t>Unique 8-char identifier</w:t>
+              <w:t>Mock loading, filtering, empty data, missing files, real API stubs</w:t>
             </w:r>
           </w:p>
         </w:tc>
@@ -2002,7 +2364,7 @@
           </w:tcPr>
           <w:p>
             <w:r>
-              <w:t>name</w:t>
+              <w:t>test_evaluation.py</w:t>
             </w:r>
           </w:p>
         </w:tc>
@@ -2012,7 +2374,7 @@
           </w:tcPr>
           <w:p>
             <w:r>
-              <w:t>string</w:t>
+              <w:t>22</w:t>
             </w:r>
           </w:p>
         </w:tc>
@@ -2022,7 +2384,7 @@
           </w:tcPr>
           <w:p>
             <w:r>
-              <w:t>Release version name (e.g., "v2.4.0")</w:t>
+              <w:t>All 4 metrics, edge cases (empty, partial, perfect), fuzzy matching</w:t>
             </w:r>
           </w:p>
         </w:tc>
@@ -2034,7 +2396,7 @@
           </w:tcPr>
           <w:p>
             <w:r>
-              <w:t>status</w:t>
+              <w:t>test_rag.py</w:t>
             </w:r>
           </w:p>
         </w:tc>
@@ -2044,7 +2406,7 @@
           </w:tcPr>
           <w:p>
             <w:r>
-              <w:t>enum</w:t>
+              <w:t>24</w:t>
             </w:r>
           </w:p>
         </w:tc>
@@ -2054,7 +2416,7 @@
           </w:tcPr>
           <w:p>
             <w:r>
-              <w:t>"review" | "needs_revision" | "approved" | "rejected"</w:t>
+              <w:t>Chunking, section splitting, cosine similarity, index persistence, corruption</w:t>
             </w:r>
           </w:p>
         </w:tc>
@@ -2066,7 +2428,7 @@
           </w:tcPr>
           <w:p>
             <w:r>
-              <w:t>created_at</w:t>
+              <w:t>test_agents.py</w:t>
             </w:r>
           </w:p>
         </w:tc>
@@ -2076,7 +2438,7 @@
           </w:tcPr>
           <w:p>
             <w:r>
-              <w:t>ISO8601</w:t>
+              <w:t>20</w:t>
             </w:r>
           </w:p>
         </w:tc>
@@ -2086,7 +2448,7 @@
           </w:tcPr>
           <w:p>
             <w:r>
-              <w:t>Generation timestamp</w:t>
+              <w:t>Output validation, text truncation, error types, schema enforcement</w:t>
             </w:r>
           </w:p>
         </w:tc>
@@ -2098,7 +2460,7 @@
           </w:tcPr>
           <w:p>
             <w:r>
-              <w:t>artifacts.changelog</w:t>
+              <w:t>test_api.py</w:t>
             </w:r>
           </w:p>
         </w:tc>
@@ -2108,7 +2470,7 @@
           </w:tcPr>
           <w:p>
             <w:r>
-              <w:t>markdown string</w:t>
+              <w:t>18</w:t>
             </w:r>
           </w:p>
         </w:tc>
@@ -2118,7 +2480,7 @@
           </w:tcPr>
           <w:p>
             <w:r>
-              <w:t>Full changelog</w:t>
+              <w:t>HTTP endpoints, status codes, LRU eviction, request validation, conflicts</w:t>
             </w:r>
           </w:p>
         </w:tc>
@@ -2130,7 +2492,7 @@
           </w:tcPr>
           <w:p>
             <w:r>
-              <w:t>artifacts.internal_release_notes</w:t>
+              <w:t>test_config.py</w:t>
             </w:r>
           </w:p>
         </w:tc>
@@ -2140,7 +2502,7 @@
           </w:tcPr>
           <w:p>
             <w:r>
-              <w:t>markdown string</w:t>
+              <w:t>7</w:t>
             </w:r>
           </w:p>
         </w:tc>
@@ -2150,7 +2512,137 @@
           </w:tcPr>
           <w:p>
             <w:r>
-              <w:t>Engineering-focused notes</w:t>
+              <w:t>Config validation, defaults, error messages</w:t>
+            </w:r>
+          </w:p>
+        </w:tc>
+      </w:tr>
+    </w:tbl>
+    <w:p>
+      <w:pPr>
+        <w:pStyle w:val="Heading2"/>
+      </w:pPr>
+      <w:r>
+        <w:t>Edge Cases Tested</w:t>
+      </w:r>
+    </w:p>
+    <w:p>
+      <w:pPr>
+        <w:pStyle w:val="ListBullet"/>
+      </w:pPr>
+      <w:r>
+        <w:t>Empty inputs (no commits, no tickets, no docs)</w:t>
+      </w:r>
+    </w:p>
+    <w:p>
+      <w:pPr>
+        <w:pStyle w:val="ListBullet"/>
+      </w:pPr>
+      <w:r>
+        <w:t>Malformed data (corrupted JSON, missing fields, wrong types)</w:t>
+      </w:r>
+    </w:p>
+    <w:p>
+      <w:pPr>
+        <w:pStyle w:val="ListBullet"/>
+      </w:pPr>
+      <w:r>
+        <w:t>Boundary conditions (exact limits, one-off, zero-length)</w:t>
+      </w:r>
+    </w:p>
+    <w:p>
+      <w:pPr>
+        <w:pStyle w:val="ListBullet"/>
+      </w:pPr>
+      <w:r>
+        <w:t>LLM response issues (non-JSON, empty, out-of-range scores)</w:t>
+      </w:r>
+    </w:p>
+    <w:p>
+      <w:pPr>
+        <w:pStyle w:val="ListBullet"/>
+      </w:pPr>
+      <w:r>
+        <w:t>Concurrency (LRU eviction under capacity pressure)</w:t>
+      </w:r>
+    </w:p>
+    <w:p>
+      <w:pPr>
+        <w:pStyle w:val="ListBullet"/>
+      </w:pPr>
+      <w:r>
+        <w:t>API conflicts (double-approve, reject-after-approve)</w:t>
+      </w:r>
+    </w:p>
+    <w:p>
+      <w:pPr>
+        <w:pStyle w:val="ListBullet"/>
+      </w:pPr>
+      <w:r>
+        <w:t>File system issues (missing files, encoding errors, corrupt index)</w:t>
+      </w:r>
+    </w:p>
+    <w:p>
+      <w:r>
+        <w:br w:type="page"/>
+      </w:r>
+    </w:p>
+    <w:p>
+      <w:pPr>
+        <w:pStyle w:val="Heading1"/>
+      </w:pPr>
+      <w:r>
+        <w:t>10. Design Decisions &amp; Tradeoffs</w:t>
+      </w:r>
+    </w:p>
+    <w:tbl>
+      <w:tblPr>
+        <w:tblStyle w:val="LightShading-Accent1"/>
+        <w:tblW w:type="auto" w:w="0"/>
+        <w:tblLook w:firstColumn="1" w:firstRow="1" w:lastColumn="0" w:lastRow="0" w:noHBand="0" w:noVBand="1" w:val="04A0"/>
+      </w:tblPr>
+      <w:tblGrid>
+        <w:gridCol w:w="2880"/>
+        <w:gridCol w:w="2880"/>
+        <w:gridCol w:w="2880"/>
+      </w:tblGrid>
+      <w:tr>
+        <w:tc>
+          <w:tcPr>
+            <w:tcW w:type="dxa" w:w="2880"/>
+          </w:tcPr>
+          <w:p>
+            <w:r>
+              <w:rPr>
+                <w:b/>
+              </w:rPr>
+              <w:t>Decision</w:t>
+            </w:r>
+          </w:p>
+        </w:tc>
+        <w:tc>
+          <w:tcPr>
+            <w:tcW w:type="dxa" w:w="2880"/>
+          </w:tcPr>
+          <w:p>
+            <w:r>
+              <w:rPr>
+                <w:b/>
+              </w:rPr>
+              <w:t>Benefit</w:t>
+            </w:r>
+          </w:p>
+        </w:tc>
+        <w:tc>
+          <w:tcPr>
+            <w:tcW w:type="dxa" w:w="2880"/>
+          </w:tcPr>
+          <w:p>
+            <w:r>
+              <w:rPr>
+                <w:b/>
+              </w:rPr>
+              <w:t>Tradeoff</w:t>
             </w:r>
           </w:p>
         </w:tc>
@@ -2162,7 +2654,7 @@
           </w:tcPr>
           <w:p>
             <w:r>
-              <w:t>artifacts.customer_release_notes</w:t>
+              <w:t>Multi-Agent over Monolithic</w:t>
             </w:r>
           </w:p>
         </w:tc>
@@ -2172,7 +2664,7 @@
           </w:tcPr>
           <w:p>
             <w:r>
-              <w:t>markdown string</w:t>
+              <w:t>Focused prompts, independent debugging, quality gate via Reviewer</w:t>
             </w:r>
           </w:p>
         </w:tc>
@@ -2182,7 +2674,7 @@
           </w:tcPr>
           <w:p>
             <w:r>
-              <w:t>Customer-facing notes</w:t>
+              <w:t>4 API calls per generation, ~15s latency</w:t>
             </w:r>
           </w:p>
         </w:tc>
@@ -2194,7 +2686,7 @@
           </w:tcPr>
           <w:p>
             <w:r>
-              <w:t>artifacts.documentation_updates[]</w:t>
+              <w:t>OpenAI over Local Models</w:t>
             </w:r>
           </w:p>
         </w:tc>
@@ -2204,7 +2696,7 @@
           </w:tcPr>
           <w:p>
             <w:r>
-              <w:t>array</w:t>
+              <w:t>No GPU, excellent JSON mode, low cost ($0.02/gen)</w:t>
             </w:r>
           </w:p>
         </w:tc>
@@ -2214,7 +2706,7 @@
           </w:tcPr>
           <w:p>
             <w:r>
-              <w:t>{doc_path, section, suggested_content, action}</w:t>
+              <w:t>Requires internet + API key</w:t>
             </w:r>
           </w:p>
         </w:tc>
@@ -2226,7 +2718,7 @@
           </w:tcPr>
           <w:p>
             <w:r>
-              <w:t>evaluation.hallucination_rate</w:t>
+              <w:t>NumPy over ChromaDB</w:t>
             </w:r>
           </w:p>
         </w:tc>
@@ -2236,7 +2728,7 @@
           </w:tcPr>
           <w:p>
             <w:r>
-              <w:t>float 0-1</w:t>
+              <w:t>Zero deps, fast for &lt;1K chunks, single-file store</w:t>
             </w:r>
           </w:p>
         </w:tc>
@@ -2246,7 +2738,7 @@
           </w:tcPr>
           <w:p>
             <w:r>
-              <w:t>Fraction of hallucinated claims</w:t>
+              <w:t>No ANN; O(n) search</w:t>
             </w:r>
           </w:p>
         </w:tc>
@@ -2258,7 +2750,7 @@
           </w:tcPr>
           <w:p>
             <w:r>
-              <w:t>evaluation.ticket_coverage</w:t>
+              <w:t>Content-Hash Caching</w:t>
             </w:r>
           </w:p>
         </w:tc>
@@ -2268,7 +2760,7 @@
           </w:tcPr>
           <w:p>
             <w:r>
-              <w:t>float 0-1</w:t>
+              <w:t>Skip RAG rebuild when docs unchanged</w:t>
             </w:r>
           </w:p>
         </w:tc>
@@ -2278,7 +2770,7 @@
           </w:tcPr>
           <w:p>
             <w:r>
-              <w:t>Fraction of tickets mentioned</w:t>
+              <w:t>Extra hash computation per request</w:t>
             </w:r>
           </w:p>
         </w:tc>
@@ -2290,7 +2782,7 @@
           </w:tcPr>
           <w:p>
             <w:r>
-              <w:t>evaluation.overall_score</w:t>
+              <w:t>LRU Store over Database</w:t>
             </w:r>
           </w:p>
         </w:tc>
@@ -2300,7 +2792,7 @@
           </w:tcPr>
           <w:p>
             <w:r>
-              <w:t>float 0-1</w:t>
+              <w:t>Zero setup, fast, good for demo/evaluation</w:t>
             </w:r>
           </w:p>
         </w:tc>
@@ -2310,7 +2802,71 @@
           </w:tcPr>
           <w:p>
             <w:r>
-              <w:t>Weighted composite score</w:t>
+              <w:t>Data lost on restart</w:t>
+            </w:r>
+          </w:p>
+        </w:tc>
+      </w:tr>
+      <w:tr>
+        <w:tc>
+          <w:tcPr>
+            <w:tcW w:type="dxa" w:w="2880"/>
+          </w:tcPr>
+          <w:p>
+            <w:r>
+              <w:t>Structured Logging</w:t>
+            </w:r>
+          </w:p>
+        </w:tc>
+        <w:tc>
+          <w:tcPr>
+            <w:tcW w:type="dxa" w:w="2880"/>
+          </w:tcPr>
+          <w:p>
+            <w:r>
+              <w:t>Machine-parseable, includes release_id + agent + duration</w:t>
+            </w:r>
+          </w:p>
+        </w:tc>
+        <w:tc>
+          <w:tcPr>
+            <w:tcW w:type="dxa" w:w="2880"/>
+          </w:tcPr>
+          <w:p>
+            <w:r>
+              <w:t>Slightly more verbose</w:t>
+            </w:r>
+          </w:p>
+        </w:tc>
+      </w:tr>
+      <w:tr>
+        <w:tc>
+          <w:tcPr>
+            <w:tcW w:type="dxa" w:w="2880"/>
+          </w:tcPr>
+          <w:p>
+            <w:r>
+              <w:t>Strict Output Validation</w:t>
+            </w:r>
+          </w:p>
+        </w:tc>
+        <w:tc>
+          <w:tcPr>
+            <w:tcW w:type="dxa" w:w="2880"/>
+          </w:tcPr>
+          <w:p>
+            <w:r>
+              <w:t>Agents never return partial/invalid schemas</w:t>
+            </w:r>
+          </w:p>
+        </w:tc>
+        <w:tc>
+          <w:tcPr>
+            <w:tcW w:type="dxa" w:w="2880"/>
+          </w:tcPr>
+          <w:p>
+            <w:r>
+              <w:t>Extra code complexity in base.py</w:t>
             </w:r>
           </w:p>
         </w:tc>
@@ -2326,325 +2882,7 @@
         <w:pStyle w:val="Heading1"/>
       </w:pPr>
       <w:r>
-        <w:t>8. Data Flow</w:t>
-      </w:r>
-    </w:p>
-    <w:p>
-      <w:pPr>
-        <w:pStyle w:val="Heading2"/>
-      </w:pPr>
-      <w:r>
-        <w:t>Sequence of Operations</w:t>
-      </w:r>
-    </w:p>
-    <w:p>
-      <w:r>
-        <w:rPr>
-          <w:rFonts w:ascii="Courier New" w:hAnsi="Courier New"/>
-          <w:sz w:val="17"/>
-        </w:rPr>
-        <w:br/>
-        <w:t>User → Frontend → POST /api/releases/generate</w:t>
-        <w:br/>
-        <w:t xml:space="preserve">                       │</w:t>
-        <w:br/>
-        <w:t xml:space="preserve">                       ├─ 1. Load mock data (commits, PRs, tickets, docs)</w:t>
-        <w:br/>
-        <w:t xml:space="preserve">                       │</w:t>
-        <w:br/>
-        <w:t xml:space="preserve">                       ├─ 2. Build RAG index</w:t>
-        <w:br/>
-        <w:t xml:space="preserve">                       │      Documents → Section Split → Chunk → Embed → Store</w:t>
-        <w:br/>
-        <w:t xml:space="preserve">                       │</w:t>
-        <w:br/>
-        <w:t xml:space="preserve">                       ├─ 3. Digester Agent</w:t>
-        <w:br/>
-        <w:t xml:space="preserve">                       │      Input: commits + PRs + tickets</w:t>
-        <w:br/>
-        <w:t xml:space="preserve">                       │      → OpenAI GPT-4o-mini (temp=0.1, JSON mode)</w:t>
-        <w:br/>
-        <w:t xml:space="preserve">                       │      Output: structured digest</w:t>
-        <w:br/>
-        <w:t xml:space="preserve">                       │</w:t>
-        <w:br/>
-        <w:t xml:space="preserve">                       ├─ 4. Planner Agent</w:t>
-        <w:br/>
-        <w:t xml:space="preserve">                       │      Input: digest + existing doc list</w:t>
-        <w:br/>
-        <w:t xml:space="preserve">                       │      → OpenAI GPT-4o-mini (temp=0.2, JSON mode)</w:t>
-        <w:br/>
-        <w:t xml:space="preserve">                       │      Output: documentation plan</w:t>
-        <w:br/>
-        <w:t xml:space="preserve">                       │</w:t>
-        <w:br/>
-        <w:t xml:space="preserve">                       ├─ 5. RAG Retrieval</w:t>
-        <w:br/>
-        <w:t xml:space="preserve">                       │      Query: digest.summary + affected_systems</w:t>
-        <w:br/>
-        <w:t xml:space="preserve">                       │      → Embed query → Cosine similarity → Top-5 chunks</w:t>
-        <w:br/>
-        <w:t xml:space="preserve">                       │</w:t>
-        <w:br/>
-        <w:t xml:space="preserve">                       ├─ 6. Writer Agent</w:t>
-        <w:br/>
-        <w:t xml:space="preserve">                       │      Input: digest + plan + top-5 RAG chunks</w:t>
-        <w:br/>
-        <w:t xml:space="preserve">                       │      → OpenAI GPT-4o-mini (temp=0.3, JSON mode)</w:t>
-        <w:br/>
-        <w:t xml:space="preserve">                       │      Output: changelog, internal notes, customer notes, doc updates</w:t>
-        <w:br/>
-        <w:t xml:space="preserve">                       │</w:t>
-        <w:br/>
-        <w:t xml:space="preserve">                       ├─ 7. Reviewer Agent</w:t>
-        <w:br/>
-        <w:t xml:space="preserve">                       │      Input: generated output + source evidence</w:t>
-        <w:br/>
-        <w:t xml:space="preserve">                       │      → OpenAI GPT-4o-mini (temp=0.1, JSON mode)</w:t>
-        <w:br/>
-        <w:t xml:space="preserve">                       │      Output: score, hallucinations, coverage gaps, approved flag</w:t>
-        <w:br/>
-        <w:t xml:space="preserve">                       │</w:t>
-        <w:br/>
-        <w:t xml:space="preserve">                       ├─ 8. Evaluation (local compute, no LLM)</w:t>
-        <w:br/>
-        <w:t xml:space="preserve">                       │      Compute: hallucination rate, ticket coverage, doc accuracy</w:t>
-        <w:br/>
-        <w:t xml:space="preserve">                       │</w:t>
-        <w:br/>
-        <w:t xml:space="preserve">                       └─ 9. Return complete release object to frontend</w:t>
-        <w:br/>
-      </w:r>
-    </w:p>
-    <w:p>
-      <w:r>
-        <w:br w:type="page"/>
-      </w:r>
-    </w:p>
-    <w:p>
-      <w:pPr>
-        <w:pStyle w:val="Heading1"/>
-      </w:pPr>
-      <w:r>
-        <w:t>9. Design Decisions &amp; Tradeoffs</w:t>
-      </w:r>
-    </w:p>
-    <w:p>
-      <w:pPr>
-        <w:pStyle w:val="Heading2"/>
-      </w:pPr>
-      <w:r>
-        <w:t>Multi-Agent Pipeline over Monolithic Prompt</w:t>
-      </w:r>
-    </w:p>
-    <w:p>
-      <w:r>
-        <w:rPr>
-          <w:b/>
-        </w:rPr>
-        <w:t xml:space="preserve">Decision: </w:t>
-      </w:r>
-      <w:r>
-        <w:t>Four specialized agents instead of one large prompt.</w:t>
-      </w:r>
-    </w:p>
-    <w:p>
-      <w:r>
-        <w:rPr>
-          <w:b/>
-        </w:rPr>
-        <w:t xml:space="preserve">Benefits: </w:t>
-      </w:r>
-      <w:r>
-        <w:t>Focused prompts, debuggable intermediate outputs, independent improvement.</w:t>
-      </w:r>
-    </w:p>
-    <w:p>
-      <w:r>
-        <w:rPr>
-          <w:b/>
-        </w:rPr>
-        <w:t xml:space="preserve">Tradeoff: </w:t>
-      </w:r>
-      <w:r>
-        <w:t>More API calls (4 per generation), ~15s latency, higher cost per run.</w:t>
-      </w:r>
-    </w:p>
-    <w:p>
-      <w:pPr>
-        <w:pStyle w:val="Heading2"/>
-      </w:pPr>
-      <w:r>
-        <w:t>OpenAI API over Local Models</w:t>
-      </w:r>
-    </w:p>
-    <w:p>
-      <w:r>
-        <w:rPr>
-          <w:b/>
-        </w:rPr>
-        <w:t xml:space="preserve">Decision: </w:t>
-      </w:r>
-      <w:r>
-        <w:t>GPT-4o-mini for generation, text-embedding-3-small for embeddings.</w:t>
-      </w:r>
-    </w:p>
-    <w:p>
-      <w:r>
-        <w:rPr>
-          <w:b/>
-        </w:rPr>
-        <w:t xml:space="preserve">Benefits: </w:t>
-      </w:r>
-      <w:r>
-        <w:t>No GPU required, excellent JSON mode, works anywhere with internet.</w:t>
-      </w:r>
-    </w:p>
-    <w:p>
-      <w:r>
-        <w:rPr>
-          <w:b/>
-        </w:rPr>
-        <w:t xml:space="preserve">Tradeoff: </w:t>
-      </w:r>
-      <w:r>
-        <w:t>Requires API key, data sent to OpenAI, cost per call (~$0.02/generation).</w:t>
-      </w:r>
-    </w:p>
-    <w:p>
-      <w:pPr>
-        <w:pStyle w:val="Heading2"/>
-      </w:pPr>
-      <w:r>
-        <w:t>NumPy Vector Store over ChromaDB/Pinecone</w:t>
-      </w:r>
-    </w:p>
-    <w:p>
-      <w:r>
-        <w:rPr>
-          <w:b/>
-        </w:rPr>
-        <w:t xml:space="preserve">Decision: </w:t>
-      </w:r>
-      <w:r>
-        <w:t>JSON file + NumPy cosine similarity for document retrieval.</w:t>
-      </w:r>
-    </w:p>
-    <w:p>
-      <w:r>
-        <w:rPr>
-          <w:b/>
-        </w:rPr>
-        <w:t xml:space="preserve">Benefits: </w:t>
-      </w:r>
-      <w:r>
-        <w:t>Zero infrastructure, no heavy deps, fast for small corpora.</w:t>
-      </w:r>
-    </w:p>
-    <w:p>
-      <w:r>
-        <w:rPr>
-          <w:b/>
-        </w:rPr>
-        <w:t xml:space="preserve">Tradeoff: </w:t>
-      </w:r>
-      <w:r>
-        <w:t>Won't scale past ~10K documents. No ANN optimizations.</w:t>
-      </w:r>
-    </w:p>
-    <w:p>
-      <w:pPr>
-        <w:pStyle w:val="Heading2"/>
-      </w:pPr>
-      <w:r>
-        <w:t>Mock Data by Default</w:t>
-      </w:r>
-    </w:p>
-    <w:p>
-      <w:r>
-        <w:rPr>
-          <w:b/>
-        </w:rPr>
-        <w:t xml:space="preserve">Decision: </w:t>
-      </w:r>
-      <w:r>
-        <w:t>Rich mock JSON files; real API integration is opt-in.</w:t>
-      </w:r>
-    </w:p>
-    <w:p>
-      <w:r>
-        <w:rPr>
-          <w:b/>
-        </w:rPr>
-        <w:t xml:space="preserve">Benefits: </w:t>
-      </w:r>
-      <w:r>
-        <w:t>Immediate demo without external accounts, clear data shape documentation.</w:t>
-      </w:r>
-    </w:p>
-    <w:p>
-      <w:r>
-        <w:rPr>
-          <w:b/>
-        </w:rPr>
-        <w:t xml:space="preserve">Tradeoff: </w:t>
-      </w:r>
-      <w:r>
-        <w:t>Doesn't demonstrate real API error handling or pagination.</w:t>
-      </w:r>
-    </w:p>
-    <w:p>
-      <w:pPr>
-        <w:pStyle w:val="Heading2"/>
-      </w:pPr>
-      <w:r>
-        <w:t>In-Memory Store over Database</w:t>
-      </w:r>
-    </w:p>
-    <w:p>
-      <w:r>
-        <w:rPr>
-          <w:b/>
-        </w:rPr>
-        <w:t xml:space="preserve">Decision: </w:t>
-      </w:r>
-      <w:r>
-        <w:t>Python dict for release storage.</w:t>
-      </w:r>
-    </w:p>
-    <w:p>
-      <w:r>
-        <w:rPr>
-          <w:b/>
-        </w:rPr>
-        <w:t xml:space="preserve">Benefits: </w:t>
-      </w:r>
-      <w:r>
-        <w:t>Zero setup, fast development iteration.</w:t>
-      </w:r>
-    </w:p>
-    <w:p>
-      <w:r>
-        <w:rPr>
-          <w:b/>
-        </w:rPr>
-        <w:t xml:space="preserve">Tradeoff: </w:t>
-      </w:r>
-      <w:r>
-        <w:t>Data lost on restart. Single-process only. Fine for demo/evaluation.</w:t>
-      </w:r>
-    </w:p>
-    <w:p>
-      <w:r>
-        <w:br w:type="page"/>
-      </w:r>
-    </w:p>
-    <w:p>
-      <w:pPr>
-        <w:pStyle w:val="Heading1"/>
-      </w:pPr>
-      <w:r>
-        <w:t>10. Security Considerations</w:t>
+        <w:t>11. Security Considerations</w:t>
       </w:r>
     </w:p>
     <w:p>
@@ -2655,7 +2893,7 @@
         <w:t xml:space="preserve">API Key Isolation: </w:t>
       </w:r>
       <w:r>
-        <w:t>OpenAI key stored in .env file, excluded from version control via .gitignore.</w:t>
+        <w:t>.env file excluded from git. Validated on startup with clear error message.</w:t>
       </w:r>
     </w:p>
     <w:p>
@@ -2663,21 +2901,10 @@
         <w:rPr>
           <w:b/>
         </w:rPr>
-        <w:t xml:space="preserve">CORS Policy: </w:t>
+        <w:t xml:space="preserve">CORS Restriction: </w:t>
       </w:r>
       <w:r>
-        <w:t>Only localhost:3000 is allowed; prevents unauthorized cross-origin access.</w:t>
-      </w:r>
-    </w:p>
-    <w:p>
-      <w:r>
-        <w:rPr>
-          <w:b/>
-        </w:rPr>
-        <w:t xml:space="preserve">No PII in Mock Data: </w:t>
-      </w:r>
-      <w:r>
-        <w:t>All mock data uses fictional names, repos, and ticket numbers.</w:t>
+        <w:t>Only configured origins allowed (default: localhost:3000 only).</w:t>
       </w:r>
     </w:p>
     <w:p>
@@ -2688,7 +2915,7 @@
         <w:t xml:space="preserve">Input Validation: </w:t>
       </w:r>
       <w:r>
-        <w:t>All request bodies validated via Pydantic models before processing.</w:t>
+        <w:t>Pydantic models with min/max length. Rejects oversized payloads.</w:t>
       </w:r>
     </w:p>
     <w:p>
@@ -2699,7 +2926,7 @@
         <w:t xml:space="preserve">No File Uploads: </w:t>
       </w:r>
       <w:r>
-        <w:t>Documentation is loaded from server filesystem only; no user uploads.</w:t>
+        <w:t>All docs loaded from server filesystem. No user-controlled file paths.</w:t>
       </w:r>
     </w:p>
     <w:p>
@@ -2707,10 +2934,32 @@
         <w:rPr>
           <w:b/>
         </w:rPr>
-        <w:t xml:space="preserve">No Persistent Storage of Secrets: </w:t>
+        <w:t xml:space="preserve">No PII: </w:t>
       </w:r>
       <w:r>
-        <w:t>API keys are read from environment at runtime, never written to disk by the application.</w:t>
+        <w:t>Mock data uses fictional names. No real credentials or tokens in codebase.</w:t>
+      </w:r>
+    </w:p>
+    <w:p>
+      <w:r>
+        <w:rPr>
+          <w:b/>
+        </w:rPr>
+        <w:t xml:space="preserve">Output Sanitization: </w:t>
+      </w:r>
+      <w:r>
+        <w:t>Frontend renders markdown via react-markdown (no raw HTML injection).</w:t>
+      </w:r>
+    </w:p>
+    <w:p>
+      <w:r>
+        <w:rPr>
+          <w:b/>
+        </w:rPr>
+        <w:t xml:space="preserve">Rate Limiting: </w:t>
+      </w:r>
+      <w:r>
+        <w:t>OpenAI rate limits handled server-side; client never sees raw API errors.</w:t>
       </w:r>
     </w:p>
     <w:p>
@@ -2718,7 +2967,7 @@
         <w:pStyle w:val="Heading1"/>
       </w:pPr>
       <w:r>
-        <w:t>11. Scaling &amp; Production Path</w:t>
+        <w:t>12. Scaling &amp; Production Path</w:t>
       </w:r>
     </w:p>
     <w:tbl>
@@ -2768,7 +3017,7 @@
               <w:rPr>
                 <w:b/>
               </w:rPr>
-              <w:t>Trigger to Switch</w:t>
+              <w:t>Trigger</w:t>
             </w:r>
           </w:p>
         </w:tc>
@@ -2780,7 +3029,7 @@
           </w:tcPr>
           <w:p>
             <w:r>
-              <w:t>In-memory dict</w:t>
+              <w:t>In-memory LRU (100)</w:t>
             </w:r>
           </w:p>
         </w:tc>
@@ -2790,7 +3039,7 @@
           </w:tcPr>
           <w:p>
             <w:r>
-              <w:t>PostgreSQL + SQLAlchemy</w:t>
+              <w:t>PostgreSQL</w:t>
             </w:r>
           </w:p>
         </w:tc>
@@ -2800,7 +3049,7 @@
           </w:tcPr>
           <w:p>
             <w:r>
-              <w:t>Multi-user or persistence needed</w:t>
+              <w:t>Need persistence or &gt;1 instance</w:t>
             </w:r>
           </w:p>
         </w:tc>
@@ -2822,7 +3071,7 @@
           </w:tcPr>
           <w:p>
             <w:r>
-              <w:t>pgvector or Pinecone</w:t>
+              <w:t>pgvector / Pinecone</w:t>
             </w:r>
           </w:p>
         </w:tc>
@@ -2832,7 +3081,7 @@
           </w:tcPr>
           <w:p>
             <w:r>
-              <w:t>&gt;10K documents in corpus</w:t>
+              <w:t>&gt;10K documents</w:t>
             </w:r>
           </w:p>
         </w:tc>
@@ -2844,7 +3093,7 @@
           </w:tcPr>
           <w:p>
             <w:r>
-              <w:t>Synchronous API</w:t>
+              <w:t>Sync endpoint (~20s)</w:t>
             </w:r>
           </w:p>
         </w:tc>
@@ -2854,7 +3103,7 @@
           </w:tcPr>
           <w:p>
             <w:r>
-              <w:t>Background tasks + WebSocket</w:t>
+              <w:t>Celery + WebSocket</w:t>
             </w:r>
           </w:p>
         </w:tc>
@@ -2864,7 +3113,7 @@
           </w:tcPr>
           <w:p>
             <w:r>
-              <w:t>&gt;30s generation time</w:t>
+              <w:t>Multiple concurrent users</w:t>
             </w:r>
           </w:p>
         </w:tc>
@@ -2886,7 +3135,7 @@
           </w:tcPr>
           <w:p>
             <w:r>
-              <w:t>Celery + Redis workers</w:t>
+              <w:t>Gunicorn workers</w:t>
             </w:r>
           </w:p>
         </w:tc>
@@ -2896,7 +3145,7 @@
           </w:tcPr>
           <w:p>
             <w:r>
-              <w:t>Multiple concurrent users</w:t>
+              <w:t>High request volume</w:t>
             </w:r>
           </w:p>
         </w:tc>
@@ -2908,7 +3157,7 @@
           </w:tcPr>
           <w:p>
             <w:r>
-              <w:t>No authentication</w:t>
+              <w:t>No auth</w:t>
             </w:r>
           </w:p>
         </w:tc>
@@ -2918,7 +3167,7 @@
           </w:tcPr>
           <w:p>
             <w:r>
-              <w:t>OAuth2 / JWT tokens</w:t>
+              <w:t>OAuth2 + JWT</w:t>
             </w:r>
           </w:p>
         </w:tc>
@@ -2950,7 +3199,7 @@
           </w:tcPr>
           <w:p>
             <w:r>
-              <w:t>Real GitHub/Jira OAuth apps</w:t>
+              <w:t>GitHub/Jira OAuth</w:t>
             </w:r>
           </w:p>
         </w:tc>
@@ -2960,7 +3209,7 @@
           </w:tcPr>
           <w:p>
             <w:r>
-              <w:t>Production integration</w:t>
+              <w:t>Real CI/CD integration</w:t>
             </w:r>
           </w:p>
         </w:tc>
@@ -2976,7 +3225,7 @@
         <w:pStyle w:val="Heading1"/>
       </w:pPr>
       <w:r>
-        <w:t>12. Future Improvements</w:t>
+        <w:t>13. Future Improvements</w:t>
       </w:r>
     </w:p>
     <w:p>
@@ -2984,10 +3233,10 @@
         <w:rPr>
           <w:b/>
         </w:rPr>
-        <w:t xml:space="preserve">Streaming Output: </w:t>
+        <w:t xml:space="preserve">Streaming: </w:t>
       </w:r>
       <w:r>
-        <w:t>Stream agent responses to UI via Server-Sent Events for faster perceived performance and progressive rendering.</w:t>
+        <w:t>SSE streaming of agent outputs for progressive UI rendering</w:t>
       </w:r>
     </w:p>
     <w:p>
@@ -2998,7 +3247,7 @@
         <w:t xml:space="preserve">Caching Layer: </w:t>
       </w:r>
       <w:r>
-        <w:t>Cache digests for unchanged artifact sets using content hashing. Skip re-generation when inputs haven't changed.</w:t>
+        <w:t>Redis cache for digest results keyed by artifact content hash</w:t>
       </w:r>
     </w:p>
     <w:p>
@@ -3006,10 +3255,10 @@
         <w:rPr>
           <w:b/>
         </w:rPr>
-        <w:t xml:space="preserve">Real API Connectors: </w:t>
+        <w:t xml:space="preserve">Real Connectors: </w:t>
       </w:r>
       <w:r>
-        <w:t>GitHub API (commits, PRs, diffs), Jira REST API (tickets, epics), Confluence API (existing docs).</w:t>
+        <w:t>GitHub API (OAuth App), Jira Cloud REST, Confluence API</w:t>
       </w:r>
     </w:p>
     <w:p>
@@ -3017,10 +3266,10 @@
         <w:rPr>
           <w:b/>
         </w:rPr>
-        <w:t xml:space="preserve">Multi-Source Ingestion: </w:t>
+        <w:t xml:space="preserve">Multi-Source: </w:t>
       </w:r>
       <w:r>
-        <w:t>Slack thread summarization, Linear tickets, Zendesk support tickets, Google Docs.</w:t>
+        <w:t>Slack threads, Linear, Zendesk, Google Docs ingestion</w:t>
       </w:r>
     </w:p>
     <w:p>
@@ -3028,10 +3277,10 @@
         <w:rPr>
           <w:b/>
         </w:rPr>
-        <w:t xml:space="preserve">Persistent Storage: </w:t>
+        <w:t xml:space="preserve">Persistent DB: </w:t>
       </w:r>
       <w:r>
-        <w:t>SQLite or PostgreSQL for release history, audit trail, and version comparison.</w:t>
+        <w:t>SQLite for local, PostgreSQL for team deployment</w:t>
       </w:r>
     </w:p>
     <w:p>
@@ -3039,10 +3288,10 @@
         <w:rPr>
           <w:b/>
         </w:rPr>
-        <w:t xml:space="preserve">CI/CD Integration: </w:t>
+        <w:t xml:space="preserve">CI/CD Hook: </w:t>
       </w:r>
       <w:r>
-        <w:t>GitHub Action that triggers documentation generation on release tags or PR merges.</w:t>
+        <w:t>GitHub Action on release tag triggers auto-generation</w:t>
       </w:r>
     </w:p>
     <w:p>
@@ -3053,7 +3302,7 @@
         <w:t xml:space="preserve">Feedback Loop: </w:t>
       </w:r>
       <w:r>
-        <w:t>Track human edits to generated content. Use edit patterns to refine prompts over time.</w:t>
+        <w:t>Track human edits to improve prompts via fine-tuning</w:t>
       </w:r>
     </w:p>
     <w:p>
@@ -3061,10 +3310,10 @@
         <w:rPr>
           <w:b/>
         </w:rPr>
-        <w:t xml:space="preserve">Local LLM Support: </w:t>
+        <w:t xml:space="preserve">Local LLM: </w:t>
       </w:r>
       <w:r>
-        <w:t>Ollama/llama.cpp integration for air-gapped environments or cost-sensitive deployments.</w:t>
+        <w:t>Ollama/llama.cpp support for air-gapped environments</w:t>
       </w:r>
     </w:p>
     <w:p>
@@ -3072,10 +3321,10 @@
         <w:rPr>
           <w:b/>
         </w:rPr>
-        <w:t xml:space="preserve">Diff-Aware Generation: </w:t>
+        <w:t xml:space="preserve">Diff-Aware: </w:t>
       </w:r>
       <w:r>
-        <w:t>Compare against previous release docs to generate only delta changes.</w:t>
+        <w:t>Compare against previous release to generate only deltas</w:t>
       </w:r>
     </w:p>
     <w:p>
@@ -3086,7 +3335,7 @@
         <w:t xml:space="preserve">Multi-Language: </w:t>
       </w:r>
       <w:r>
-        <w:t>Generate customer-facing notes in multiple languages using translation agents.</w:t>
+        <w:t>Customer notes auto-translated to configured locales</w:t>
       </w:r>
     </w:p>
     <w:sectPr>

</xml_diff>